<commit_message>
Stablecoin plan: add Appendix A - Technical Implementation
Concrete engineering breakdown mapped to the current codebase: multi-asset
ledger + precision refactor, StablecoinProviderInterface mirroring the
mock-bank pattern, orchestration/reconciliation services, async settlement
(webhooks + Cloud Tasks/Scheduler workers), KYT/compliance hooks, API +
Flutter changes, config/security, testing, and highest-risk items.
</commit_message>
<xml_diff>
--- a/PayRails_Stablecoin_Support_Plan.docx
+++ b/PayRails_Stablecoin_Support_Plan.docx
@@ -1385,6 +1385,502 @@
         <w:t>Circle — USDC &amp; developer products: https://www.circle.com/usdc</w:t>
       </w:r>
     </w:p>
+    <w:p>
+      <w:r>
+        <w:br w:type="page"/>
+      </w:r>
+    </w:p>
+    <w:p>
+      <w:pPr>
+        <w:pStyle w:val="Heading1"/>
+      </w:pPr>
+      <w:r>
+        <w:t>Appendix A — Technical Implementation</w:t>
+      </w:r>
+    </w:p>
+    <w:p>
+      <w:r>
+        <w:t>This appendix translates the plan into concrete engineering work mapped to the current PayRails codebase (FastAPI backend, SQLAlchemy models, Alembic migrations, Flutter client). The recurring theme: the repo already has the right abstraction patterns — the BankServiceInterface / mock-bank split, the /webhooks/bank router, and the double-entry ledger — so stablecoin support is largely a matter of extending them along an ASSET dimension and an ON-CHAIN SETTLEMENT dimension.</w:t>
+      </w:r>
+    </w:p>
+    <w:p>
+      <w:pPr>
+        <w:pStyle w:val="Heading2"/>
+      </w:pPr>
+      <w:r>
+        <w:t>A.1 Data Model (Alembic + SQLAlchemy)</w:t>
+      </w:r>
+    </w:p>
+    <w:p>
+      <w:r>
+        <w:t>The ledger is USD-only today (ledger.amount is Decimal(12,2); balances are per-owner, not per-asset). Stablecoins require a multi-asset, higher-precision model.</w:t>
+      </w:r>
+    </w:p>
+    <w:p>
+      <w:pPr>
+        <w:pStyle w:val="ListBullet"/>
+      </w:pPr>
+      <w:r>
+        <w:t>Asset concept: a new 'assets' reference (code USD/USDC/USD1, type fiat/stablecoin, decimals 2 vs 6, supported chains).</w:t>
+      </w:r>
+    </w:p>
+    <w:p>
+      <w:pPr>
+        <w:pStyle w:val="ListBullet"/>
+      </w:pPr>
+      <w:r>
+        <w:t>Ledger: add an 'asset' column; make balance_after and get_balance() per (owner, asset). Today ledger_service.get_balance() returns the latest balance_after for an owner with no asset scoping, so this change touches every balance read/write.</w:t>
+      </w:r>
+    </w:p>
+    <w:p>
+      <w:pPr>
+        <w:pStyle w:val="ListBullet"/>
+      </w:pPr>
+      <w:r>
+        <w:t>Precision: 6-decimal tokens do not fit Decimal(12,2). Recommended: store integer base units (BigInteger) + asset.decimals rather than mixing 2- and 6-decimal Decimals. This is the single biggest refactor (ledger_service.py, wallet_service.py).</w:t>
+      </w:r>
+    </w:p>
+    <w:p>
+      <w:pPr>
+        <w:pStyle w:val="ListBullet"/>
+      </w:pPr>
+      <w:r>
+        <w:t>Transactions: add asset, settlement_network (ethereum/solana/bnb), onchain_tx_hash, onchain_status (submitted -&gt; confirming -&gt; confirmed/failed/reorged), confirmations, partner_transfer_id, direction (onramp/offramp/send/deposit/withdrawal). Existing rail/status enums remain for fiat.</w:t>
+      </w:r>
+    </w:p>
+    <w:p>
+      <w:pPr>
+        <w:pStyle w:val="ListBullet"/>
+      </w:pPr>
+      <w:r>
+        <w:t>New tables: crypto_accounts (owner -&gt; partner account id, deposit address, chain, asset) and sanctions_screening (address, result, provider, timestamp — audit evidence).</w:t>
+      </w:r>
+    </w:p>
+    <w:p>
+      <w:pPr>
+        <w:pStyle w:val="Heading2"/>
+      </w:pPr>
+      <w:r>
+        <w:t>A.2 Provider Integration Layer</w:t>
+      </w:r>
+    </w:p>
+    <w:p>
+      <w:r>
+        <w:t>Mirror the existing BankServiceInterface (ABC) + MockBankService pattern for crypto so business logic stays provider-agnostic and USD1 rides the same integration as USDC.</w:t>
+      </w:r>
+    </w:p>
+    <w:tbl>
+      <w:tblPr>
+        <w:tblStyle w:val="TableGrid"/>
+        <w:tblW w:type="auto" w:w="0"/>
+        <w:tblLook w:firstColumn="1" w:firstRow="1" w:lastColumn="0" w:lastRow="0" w:noHBand="0" w:noVBand="1" w:val="04A0"/>
+      </w:tblPr>
+      <w:tblGrid>
+        <w:gridCol w:w="4320"/>
+        <w:gridCol w:w="4320"/>
+      </w:tblGrid>
+      <w:tr>
+        <w:tc>
+          <w:tcPr>
+            <w:tcW w:type="dxa" w:w="4320"/>
+          </w:tcPr>
+          <w:p>
+            <w:r>
+              <w:rPr>
+                <w:b/>
+              </w:rPr>
+              <w:t>Component</w:t>
+            </w:r>
+          </w:p>
+        </w:tc>
+        <w:tc>
+          <w:tcPr>
+            <w:tcW w:type="dxa" w:w="4320"/>
+          </w:tcPr>
+          <w:p>
+            <w:r>
+              <w:rPr>
+                <w:b/>
+              </w:rPr>
+              <w:t>Purpose</w:t>
+            </w:r>
+          </w:p>
+        </w:tc>
+      </w:tr>
+      <w:tr>
+        <w:tc>
+          <w:tcPr>
+            <w:tcW w:type="dxa" w:w="4320"/>
+          </w:tcPr>
+          <w:p>
+            <w:r>
+              <w:t>StablecoinProviderInterface (ABC)</w:t>
+            </w:r>
+          </w:p>
+        </w:tc>
+        <w:tc>
+          <w:tcPr>
+            <w:tcW w:type="dxa" w:w="4320"/>
+          </w:tcPr>
+          <w:p>
+            <w:r>
+              <w:t>create_account, get_deposit_address, initiate_onramp, initiate_offramp, transfer, get_transfer_status, get_balance, submit_kyc / get_kyc_status, verify_webhook</w:t>
+            </w:r>
+          </w:p>
+        </w:tc>
+      </w:tr>
+      <w:tr>
+        <w:tc>
+          <w:tcPr>
+            <w:tcW w:type="dxa" w:w="4320"/>
+          </w:tcPr>
+          <w:p>
+            <w:r>
+              <w:t>ZeroHashProvider</w:t>
+            </w:r>
+          </w:p>
+        </w:tc>
+        <w:tc>
+          <w:tcPr>
+            <w:tcW w:type="dxa" w:w="4320"/>
+          </w:tcPr>
+          <w:p>
+            <w:r>
+              <w:t>Concrete implementation against the regulated partner API</w:t>
+            </w:r>
+          </w:p>
+        </w:tc>
+      </w:tr>
+      <w:tr>
+        <w:tc>
+          <w:tcPr>
+            <w:tcW w:type="dxa" w:w="4320"/>
+          </w:tcPr>
+          <w:p>
+            <w:r>
+              <w:t>MockStablecoinProvider</w:t>
+            </w:r>
+          </w:p>
+        </w:tc>
+        <w:tc>
+          <w:tcPr>
+            <w:tcW w:type="dxa" w:w="4320"/>
+          </w:tcPr>
+          <w:p>
+            <w:r>
+              <w:t>Deterministic dev/test double (as mock_bank.py is today)</w:t>
+            </w:r>
+          </w:p>
+        </w:tc>
+      </w:tr>
+    </w:tbl>
+    <w:p>
+      <w:pPr>
+        <w:pStyle w:val="Heading2"/>
+      </w:pPr>
+      <w:r>
+        <w:t>A.3 Services / Business Logic</w:t>
+      </w:r>
+    </w:p>
+    <w:p>
+      <w:pPr>
+        <w:pStyle w:val="ListBullet"/>
+      </w:pPr>
+      <w:r>
+        <w:t>stablecoin_service.py — orchestration analogous to payment_service.py: on-ramp, off-ramp, crypto send/receive, deposit crediting, withdrawals.</w:t>
+      </w:r>
+    </w:p>
+    <w:p>
+      <w:pPr>
+        <w:pStyle w:val="ListBullet"/>
+      </w:pPr>
+      <w:r>
+        <w:t>Extend ledger_service for asset-scoped debit/credit.</w:t>
+      </w:r>
+    </w:p>
+    <w:p>
+      <w:pPr>
+        <w:pStyle w:val="ListBullet"/>
+      </w:pPr>
+      <w:r>
+        <w:t>reconciliation_service.py — periodically compare partner/on-chain balances and transfers against the internal ledger and flag drift. This is the core audit/reporting artifact and is non-optional.</w:t>
+      </w:r>
+    </w:p>
+    <w:p>
+      <w:pPr>
+        <w:pStyle w:val="ListBullet"/>
+      </w:pPr>
+      <w:r>
+        <w:t>Settlement state machine — a transaction lifecycle (submitted -&gt; confirming -&gt; confirmed) that credits the ledger only on final confirmation.</w:t>
+      </w:r>
+    </w:p>
+    <w:p>
+      <w:pPr>
+        <w:pStyle w:val="Heading2"/>
+      </w:pPr>
+      <w:r>
+        <w:t>A.4 Asynchronous Processing (new capability)</w:t>
+      </w:r>
+    </w:p>
+    <w:p>
+      <w:r>
+        <w:t>The biggest architectural gap: the app is synchronous (request/response plus one startup event, no workers). On-chain settlement is asynchronous (seconds to minutes).</w:t>
+      </w:r>
+    </w:p>
+    <w:p>
+      <w:pPr>
+        <w:pStyle w:val="ListBullet"/>
+      </w:pPr>
+      <w:r>
+        <w:t>Partner webhook router (routers/stablecoin_webhooks.py) mirroring /webhooks/bank, WITH signature verification (an existing gap, now mandatory) and idempotent event handling keyed by tx hash / event id.</w:t>
+      </w:r>
+    </w:p>
+    <w:p>
+      <w:pPr>
+        <w:pStyle w:val="ListBullet"/>
+      </w:pPr>
+      <w:r>
+        <w:t>Background worker to poll/settle and run reconciliation on a schedule. On Cloud Run the natural fit is Cloud Tasks + Cloud Scheduler hitting a secured worker endpoint (or a Cloud Run Job) — no Celery infrastructure required.</w:t>
+      </w:r>
+    </w:p>
+    <w:p>
+      <w:pPr>
+        <w:pStyle w:val="Heading2"/>
+      </w:pPr>
+      <w:r>
+        <w:t>A.5 Compliance &amp; Reporting Hooks (technical)</w:t>
+      </w:r>
+    </w:p>
+    <w:p>
+      <w:pPr>
+        <w:pStyle w:val="ListBullet"/>
+      </w:pPr>
+      <w:r>
+        <w:t>KYT integration (Chainalysis / TRM / Elliptic): screen counterparty addresses and transactions; persist results linked to transactions.</w:t>
+      </w:r>
+    </w:p>
+    <w:p>
+      <w:pPr>
+        <w:pStyle w:val="ListBullet"/>
+      </w:pPr>
+      <w:r>
+        <w:t>On-chain audit trail: guarantee every ledger entry links to onchain_tx_hash + partner_transfer_id; build export queries that feed SAR/CTR/1099-DA and MTL call-report data (mostly handed to the partner).</w:t>
+      </w:r>
+    </w:p>
+    <w:p>
+      <w:pPr>
+        <w:pStyle w:val="ListBullet"/>
+      </w:pPr>
+      <w:r>
+        <w:t>Extend the existing event_logs table with stablecoin.* event types.</w:t>
+      </w:r>
+    </w:p>
+    <w:p>
+      <w:pPr>
+        <w:pStyle w:val="Heading2"/>
+      </w:pPr>
+      <w:r>
+        <w:t>A.6 API + Flutter Client</w:t>
+      </w:r>
+    </w:p>
+    <w:p>
+      <w:pPr>
+        <w:pStyle w:val="ListBullet"/>
+      </w:pPr>
+      <w:r>
+        <w:t>New endpoints: KYC start/status, get deposit address, on-ramp (buy), off-ramp (sell/withdraw), send stablecoin, per-asset balances, asset-filtered history.</w:t>
+      </w:r>
+    </w:p>
+    <w:p>
+      <w:pPr>
+        <w:pStyle w:val="ListBullet"/>
+      </w:pPr>
+      <w:r>
+        <w:t>Flutter: asset selector in wallet/send screens, per-asset balances, deposit-address/QR screen, KYC flow screens, and the 'not FDIC-insured' disclosure. Reuse the existing consumer/ wallet screens with an asset dimension.</w:t>
+      </w:r>
+    </w:p>
+    <w:p>
+      <w:pPr>
+        <w:pStyle w:val="ListBullet"/>
+      </w:pPr>
+      <w:r>
+        <w:t>The amount_input widget is hardcoded to 2-decimal USD and needs per-asset decimal handling (6 for stablecoins).</w:t>
+      </w:r>
+    </w:p>
+    <w:p>
+      <w:pPr>
+        <w:pStyle w:val="Heading2"/>
+      </w:pPr>
+      <w:r>
+        <w:t>A.7 Config / Infra / Security</w:t>
+      </w:r>
+    </w:p>
+    <w:p>
+      <w:pPr>
+        <w:pStyle w:val="ListBullet"/>
+      </w:pPr>
+      <w:r>
+        <w:t>Secrets in Secret Manager (partner API keys, webhook signing secret).</w:t>
+      </w:r>
+    </w:p>
+    <w:p>
+      <w:pPr>
+        <w:pStyle w:val="ListBullet"/>
+      </w:pPr>
+      <w:r>
+        <w:t>Config for base URLs, supported assets/chains, and per-chain confirmation thresholds; sandbox vs production partner environments.</w:t>
+      </w:r>
+    </w:p>
+    <w:p>
+      <w:pPr>
+        <w:pStyle w:val="ListBullet"/>
+      </w:pPr>
+      <w:r>
+        <w:t>Rate limiting and webhook signature verification (both existing gaps) become hard requirements.</w:t>
+      </w:r>
+    </w:p>
+    <w:p>
+      <w:pPr>
+        <w:pStyle w:val="Heading2"/>
+      </w:pPr>
+      <w:r>
+        <w:t>A.8 Testing</w:t>
+      </w:r>
+    </w:p>
+    <w:p>
+      <w:pPr>
+        <w:pStyle w:val="ListBullet"/>
+      </w:pPr>
+      <w:r>
+        <w:t>MockStablecoinProvider for deterministic tests (as test_mock_bank.py does today).</w:t>
+      </w:r>
+    </w:p>
+    <w:p>
+      <w:pPr>
+        <w:pStyle w:val="ListBullet"/>
+      </w:pPr>
+      <w:r>
+        <w:t>Tests for multi-asset ledger math, on/off-ramp, settlement transitions, reconciliation drift, webhook idempotency, and KYC gating.</w:t>
+      </w:r>
+    </w:p>
+    <w:p>
+      <w:pPr>
+        <w:pStyle w:val="Heading2"/>
+      </w:pPr>
+      <w:r>
+        <w:t>A.9 Highest-Risk Items</w:t>
+      </w:r>
+    </w:p>
+    <w:tbl>
+      <w:tblPr>
+        <w:tblStyle w:val="TableGrid"/>
+        <w:tblW w:type="auto" w:w="0"/>
+        <w:tblLook w:firstColumn="1" w:firstRow="1" w:lastColumn="0" w:lastRow="0" w:noHBand="0" w:noVBand="1" w:val="04A0"/>
+      </w:tblPr>
+      <w:tblGrid>
+        <w:gridCol w:w="4320"/>
+        <w:gridCol w:w="4320"/>
+      </w:tblGrid>
+      <w:tr>
+        <w:tc>
+          <w:tcPr>
+            <w:tcW w:type="dxa" w:w="4320"/>
+          </w:tcPr>
+          <w:p>
+            <w:r>
+              <w:rPr>
+                <w:b/>
+              </w:rPr>
+              <w:t>Item</w:t>
+            </w:r>
+          </w:p>
+        </w:tc>
+        <w:tc>
+          <w:tcPr>
+            <w:tcW w:type="dxa" w:w="4320"/>
+          </w:tcPr>
+          <w:p>
+            <w:r>
+              <w:rPr>
+                <w:b/>
+              </w:rPr>
+              <w:t>Why it is hard</w:t>
+            </w:r>
+          </w:p>
+        </w:tc>
+      </w:tr>
+      <w:tr>
+        <w:tc>
+          <w:tcPr>
+            <w:tcW w:type="dxa" w:w="4320"/>
+          </w:tcPr>
+          <w:p>
+            <w:r>
+              <w:t>Numeric-precision refactor</w:t>
+            </w:r>
+          </w:p>
+        </w:tc>
+        <w:tc>
+          <w:tcPr>
+            <w:tcW w:type="dxa" w:w="4320"/>
+          </w:tcPr>
+          <w:p>
+            <w:r>
+              <w:t>Moving the ledger to integer base units touches every money path and requires migrating existing USD balances carefully.</w:t>
+            </w:r>
+          </w:p>
+        </w:tc>
+      </w:tr>
+      <w:tr>
+        <w:tc>
+          <w:tcPr>
+            <w:tcW w:type="dxa" w:w="4320"/>
+          </w:tcPr>
+          <w:p>
+            <w:r>
+              <w:t>Async settlement + reconciliation</w:t>
+            </w:r>
+          </w:p>
+        </w:tc>
+        <w:tc>
+          <w:tcPr>
+            <w:tcW w:type="dxa" w:w="4320"/>
+          </w:tcPr>
+          <w:p>
+            <w:r>
+              <w:t>A genuinely new subsystem (workers, webhooks, state machine, idempotency) the app does not have today.</w:t>
+            </w:r>
+          </w:p>
+        </w:tc>
+      </w:tr>
+      <w:tr>
+        <w:tc>
+          <w:tcPr>
+            <w:tcW w:type="dxa" w:w="4320"/>
+          </w:tcPr>
+          <w:p>
+            <w:r>
+              <w:t>KYC gating</w:t>
+            </w:r>
+          </w:p>
+        </w:tc>
+        <w:tc>
+          <w:tcPr>
+            <w:tcW w:type="dxa" w:w="4320"/>
+          </w:tcPr>
+          <w:p>
+            <w:r>
+              <w:t>No real KYC exists (only mock KYB); a consumer-identity gate must exist before any coin goes live.</w:t>
+            </w:r>
+          </w:p>
+        </w:tc>
+      </w:tr>
+    </w:tbl>
+    <w:p>
+      <w:r>
+        <w:t>Everything else is additive and follows patterns already present in the repository.</w:t>
+      </w:r>
+    </w:p>
     <w:sectPr>
       <w:pgSz w:w="12240" w:h="15840"/>
       <w:pgMar w:top="1440" w:right="1800" w:bottom="1440" w:left="1800" w:header="720" w:footer="720" w:gutter="0"/>

</xml_diff>

<commit_message>
Stablecoin plan: add Appendix B - Technical Design (schema/migration SQL + provider interface)
- Concrete PostgreSQL DDL for assets, asset_networks, crypto_accounts,
  kyc_records, sanctions_screening; ledger multi-asset + base-unit
  precision migration with USD backfill; transactions on-chain settlement
  columns and indexes
- Representative SQLAlchemy model sketch (CryptoAccount)
- StablecoinProviderInterface ABC with full method signatures and DTOs,
  mirroring the bank interface; wiring rules and invariants
</commit_message>
<xml_diff>
--- a/PayRails_Stablecoin_Support_Plan.docx
+++ b/PayRails_Stablecoin_Support_Plan.docx
@@ -1879,6 +1879,2945 @@
     <w:p>
       <w:r>
         <w:t>Everything else is additive and follows patterns already present in the repository.</w:t>
+      </w:r>
+    </w:p>
+    <w:p>
+      <w:r>
+        <w:br w:type="page"/>
+      </w:r>
+    </w:p>
+    <w:p>
+      <w:pPr>
+        <w:pStyle w:val="Heading1"/>
+      </w:pPr>
+      <w:r>
+        <w:t>Appendix B — Technical Design: Schema, Migration &amp; Provider Interface</w:t>
+      </w:r>
+    </w:p>
+    <w:p>
+      <w:r>
+        <w:t>Concrete, review-ready design for the data model and the partner-integration contract. SQL targets the production database (PostgreSQL 15). In practice these changes are produced with `alembic revision --autogenerate` and reviewed before deploy (Alembic runs on container startup via entrypoint.sh); the DDL below documents the intended end state. Monetary values are stored as integer BASE UNITS (amount x 10^asset.decimals) to avoid mixing 2-decimal fiat with 6-decimal stablecoins.</w:t>
+      </w:r>
+    </w:p>
+    <w:p>
+      <w:pPr>
+        <w:pStyle w:val="Heading2"/>
+      </w:pPr>
+      <w:r>
+        <w:t>B.1 New &amp; Changed Tables (overview)</w:t>
+      </w:r>
+    </w:p>
+    <w:p>
+      <w:r>
+        <w:t>New: assets, asset_networks, crypto_accounts, kyc_records, sanctions_screening. Altered: ledger (multi-asset + base-unit precision), transactions (asset + on-chain settlement fields).</w:t>
+      </w:r>
+    </w:p>
+    <w:p>
+      <w:pPr>
+        <w:pStyle w:val="Heading2"/>
+      </w:pPr>
+      <w:r>
+        <w:t>B.2 Migration SQL — reference tables</w:t>
+      </w:r>
+    </w:p>
+    <w:p>
+      <w:pPr>
+        <w:spacing w:after="120"/>
+        <w:ind w:left="240"/>
+      </w:pPr>
+      <w:r>
+        <w:rPr>
+          <w:rFonts w:ascii="Consolas" w:hAnsi="Consolas"/>
+          <w:sz w:val="17"/>
+        </w:rPr>
+        <w:t>-- B.2.1  Asset reference (fiat + stablecoins)</w:t>
+      </w:r>
+      <w:r>
+        <w:rPr>
+          <w:rFonts w:ascii="Consolas" w:hAnsi="Consolas"/>
+          <w:sz w:val="17"/>
+        </w:rPr>
+        <w:br/>
+      </w:r>
+      <w:r>
+        <w:rPr>
+          <w:rFonts w:ascii="Consolas" w:hAnsi="Consolas"/>
+          <w:sz w:val="17"/>
+        </w:rPr>
+        <w:t>CREATE TABLE assets (</w:t>
+      </w:r>
+      <w:r>
+        <w:rPr>
+          <w:rFonts w:ascii="Consolas" w:hAnsi="Consolas"/>
+          <w:sz w:val="17"/>
+        </w:rPr>
+        <w:br/>
+      </w:r>
+      <w:r>
+        <w:rPr>
+          <w:rFonts w:ascii="Consolas" w:hAnsi="Consolas"/>
+          <w:sz w:val="17"/>
+        </w:rPr>
+        <w:t xml:space="preserve">    code          VARCHAR(16) PRIMARY KEY,       -- 'USD', 'USDC', 'USD1'</w:t>
+      </w:r>
+      <w:r>
+        <w:rPr>
+          <w:rFonts w:ascii="Consolas" w:hAnsi="Consolas"/>
+          <w:sz w:val="17"/>
+        </w:rPr>
+        <w:br/>
+      </w:r>
+      <w:r>
+        <w:rPr>
+          <w:rFonts w:ascii="Consolas" w:hAnsi="Consolas"/>
+          <w:sz w:val="17"/>
+        </w:rPr>
+        <w:t xml:space="preserve">    asset_type    VARCHAR(16) NOT NULL,          -- 'fiat' | 'stablecoin'</w:t>
+      </w:r>
+      <w:r>
+        <w:rPr>
+          <w:rFonts w:ascii="Consolas" w:hAnsi="Consolas"/>
+          <w:sz w:val="17"/>
+        </w:rPr>
+        <w:br/>
+      </w:r>
+      <w:r>
+        <w:rPr>
+          <w:rFonts w:ascii="Consolas" w:hAnsi="Consolas"/>
+          <w:sz w:val="17"/>
+        </w:rPr>
+        <w:t xml:space="preserve">    decimals      SMALLINT    NOT NULL,          -- 2 for USD, 6 for USDC/USD1</w:t>
+      </w:r>
+      <w:r>
+        <w:rPr>
+          <w:rFonts w:ascii="Consolas" w:hAnsi="Consolas"/>
+          <w:sz w:val="17"/>
+        </w:rPr>
+        <w:br/>
+      </w:r>
+      <w:r>
+        <w:rPr>
+          <w:rFonts w:ascii="Consolas" w:hAnsi="Consolas"/>
+          <w:sz w:val="17"/>
+        </w:rPr>
+        <w:t xml:space="preserve">    display_name  VARCHAR(64) NOT NULL,</w:t>
+      </w:r>
+      <w:r>
+        <w:rPr>
+          <w:rFonts w:ascii="Consolas" w:hAnsi="Consolas"/>
+          <w:sz w:val="17"/>
+        </w:rPr>
+        <w:br/>
+      </w:r>
+      <w:r>
+        <w:rPr>
+          <w:rFonts w:ascii="Consolas" w:hAnsi="Consolas"/>
+          <w:sz w:val="17"/>
+        </w:rPr>
+        <w:t xml:space="preserve">    is_active     BOOLEAN     NOT NULL DEFAULT TRUE</w:t>
+      </w:r>
+      <w:r>
+        <w:rPr>
+          <w:rFonts w:ascii="Consolas" w:hAnsi="Consolas"/>
+          <w:sz w:val="17"/>
+        </w:rPr>
+        <w:br/>
+      </w:r>
+      <w:r>
+        <w:rPr>
+          <w:rFonts w:ascii="Consolas" w:hAnsi="Consolas"/>
+          <w:sz w:val="17"/>
+        </w:rPr>
+        <w:t>);</w:t>
+      </w:r>
+      <w:r>
+        <w:rPr>
+          <w:rFonts w:ascii="Consolas" w:hAnsi="Consolas"/>
+          <w:sz w:val="17"/>
+        </w:rPr>
+        <w:br/>
+      </w:r>
+      <w:r>
+        <w:rPr>
+          <w:rFonts w:ascii="Consolas" w:hAnsi="Consolas"/>
+          <w:sz w:val="17"/>
+        </w:rPr>
+        <w:t>INSERT INTO assets (code, asset_type, decimals, display_name) VALUES</w:t>
+      </w:r>
+      <w:r>
+        <w:rPr>
+          <w:rFonts w:ascii="Consolas" w:hAnsi="Consolas"/>
+          <w:sz w:val="17"/>
+        </w:rPr>
+        <w:br/>
+      </w:r>
+      <w:r>
+        <w:rPr>
+          <w:rFonts w:ascii="Consolas" w:hAnsi="Consolas"/>
+          <w:sz w:val="17"/>
+        </w:rPr>
+        <w:t xml:space="preserve">    ('USD',  'fiat',       2, 'US Dollar'),</w:t>
+      </w:r>
+      <w:r>
+        <w:rPr>
+          <w:rFonts w:ascii="Consolas" w:hAnsi="Consolas"/>
+          <w:sz w:val="17"/>
+        </w:rPr>
+        <w:br/>
+      </w:r>
+      <w:r>
+        <w:rPr>
+          <w:rFonts w:ascii="Consolas" w:hAnsi="Consolas"/>
+          <w:sz w:val="17"/>
+        </w:rPr>
+        <w:t xml:space="preserve">    ('USDC', 'stablecoin', 6, 'USD Coin'),</w:t>
+      </w:r>
+      <w:r>
+        <w:rPr>
+          <w:rFonts w:ascii="Consolas" w:hAnsi="Consolas"/>
+          <w:sz w:val="17"/>
+        </w:rPr>
+        <w:br/>
+      </w:r>
+      <w:r>
+        <w:rPr>
+          <w:rFonts w:ascii="Consolas" w:hAnsi="Consolas"/>
+          <w:sz w:val="17"/>
+        </w:rPr>
+        <w:t xml:space="preserve">    ('USD1', 'stablecoin', 6, 'World Liberty USD1');</w:t>
+      </w:r>
+      <w:r>
+        <w:rPr>
+          <w:rFonts w:ascii="Consolas" w:hAnsi="Consolas"/>
+          <w:sz w:val="17"/>
+        </w:rPr>
+        <w:br/>
+      </w:r>
+      <w:r>
+        <w:rPr>
+          <w:rFonts w:ascii="Consolas" w:hAnsi="Consolas"/>
+          <w:sz w:val="17"/>
+        </w:rPr>
+      </w:r>
+      <w:r>
+        <w:rPr>
+          <w:rFonts w:ascii="Consolas" w:hAnsi="Consolas"/>
+          <w:sz w:val="17"/>
+        </w:rPr>
+        <w:br/>
+      </w:r>
+      <w:r>
+        <w:rPr>
+          <w:rFonts w:ascii="Consolas" w:hAnsi="Consolas"/>
+          <w:sz w:val="17"/>
+        </w:rPr>
+        <w:t>-- B.2.2  Supported chains per stablecoin</w:t>
+      </w:r>
+      <w:r>
+        <w:rPr>
+          <w:rFonts w:ascii="Consolas" w:hAnsi="Consolas"/>
+          <w:sz w:val="17"/>
+        </w:rPr>
+        <w:br/>
+      </w:r>
+      <w:r>
+        <w:rPr>
+          <w:rFonts w:ascii="Consolas" w:hAnsi="Consolas"/>
+          <w:sz w:val="17"/>
+        </w:rPr>
+        <w:t>CREATE TABLE asset_networks (</w:t>
+      </w:r>
+      <w:r>
+        <w:rPr>
+          <w:rFonts w:ascii="Consolas" w:hAnsi="Consolas"/>
+          <w:sz w:val="17"/>
+        </w:rPr>
+        <w:br/>
+      </w:r>
+      <w:r>
+        <w:rPr>
+          <w:rFonts w:ascii="Consolas" w:hAnsi="Consolas"/>
+          <w:sz w:val="17"/>
+        </w:rPr>
+        <w:t xml:space="preserve">    id                VARCHAR(36) PRIMARY KEY,</w:t>
+      </w:r>
+      <w:r>
+        <w:rPr>
+          <w:rFonts w:ascii="Consolas" w:hAnsi="Consolas"/>
+          <w:sz w:val="17"/>
+        </w:rPr>
+        <w:br/>
+      </w:r>
+      <w:r>
+        <w:rPr>
+          <w:rFonts w:ascii="Consolas" w:hAnsi="Consolas"/>
+          <w:sz w:val="17"/>
+        </w:rPr>
+        <w:t xml:space="preserve">    asset_code        VARCHAR(16) NOT NULL REFERENCES assets(code),</w:t>
+      </w:r>
+      <w:r>
+        <w:rPr>
+          <w:rFonts w:ascii="Consolas" w:hAnsi="Consolas"/>
+          <w:sz w:val="17"/>
+        </w:rPr>
+        <w:br/>
+      </w:r>
+      <w:r>
+        <w:rPr>
+          <w:rFonts w:ascii="Consolas" w:hAnsi="Consolas"/>
+          <w:sz w:val="17"/>
+        </w:rPr>
+        <w:t xml:space="preserve">    network           VARCHAR(32) NOT NULL,      -- 'ethereum','solana','bnb'</w:t>
+      </w:r>
+      <w:r>
+        <w:rPr>
+          <w:rFonts w:ascii="Consolas" w:hAnsi="Consolas"/>
+          <w:sz w:val="17"/>
+        </w:rPr>
+        <w:br/>
+      </w:r>
+      <w:r>
+        <w:rPr>
+          <w:rFonts w:ascii="Consolas" w:hAnsi="Consolas"/>
+          <w:sz w:val="17"/>
+        </w:rPr>
+        <w:t xml:space="preserve">    contract_address  VARCHAR(128),</w:t>
+      </w:r>
+      <w:r>
+        <w:rPr>
+          <w:rFonts w:ascii="Consolas" w:hAnsi="Consolas"/>
+          <w:sz w:val="17"/>
+        </w:rPr>
+        <w:br/>
+      </w:r>
+      <w:r>
+        <w:rPr>
+          <w:rFonts w:ascii="Consolas" w:hAnsi="Consolas"/>
+          <w:sz w:val="17"/>
+        </w:rPr>
+        <w:t xml:space="preserve">    min_confirmations SMALLINT    NOT NULL DEFAULT 12,</w:t>
+      </w:r>
+      <w:r>
+        <w:rPr>
+          <w:rFonts w:ascii="Consolas" w:hAnsi="Consolas"/>
+          <w:sz w:val="17"/>
+        </w:rPr>
+        <w:br/>
+      </w:r>
+      <w:r>
+        <w:rPr>
+          <w:rFonts w:ascii="Consolas" w:hAnsi="Consolas"/>
+          <w:sz w:val="17"/>
+        </w:rPr>
+        <w:t xml:space="preserve">    is_active         BOOLEAN     NOT NULL DEFAULT TRUE,</w:t>
+      </w:r>
+      <w:r>
+        <w:rPr>
+          <w:rFonts w:ascii="Consolas" w:hAnsi="Consolas"/>
+          <w:sz w:val="17"/>
+        </w:rPr>
+        <w:br/>
+      </w:r>
+      <w:r>
+        <w:rPr>
+          <w:rFonts w:ascii="Consolas" w:hAnsi="Consolas"/>
+          <w:sz w:val="17"/>
+        </w:rPr>
+        <w:t xml:space="preserve">    UNIQUE (asset_code, network)</w:t>
+      </w:r>
+      <w:r>
+        <w:rPr>
+          <w:rFonts w:ascii="Consolas" w:hAnsi="Consolas"/>
+          <w:sz w:val="17"/>
+        </w:rPr>
+        <w:br/>
+      </w:r>
+      <w:r>
+        <w:rPr>
+          <w:rFonts w:ascii="Consolas" w:hAnsi="Consolas"/>
+          <w:sz w:val="17"/>
+        </w:rPr>
+        <w:t>);</w:t>
+      </w:r>
+    </w:p>
+    <w:p>
+      <w:pPr>
+        <w:pStyle w:val="Heading2"/>
+      </w:pPr>
+      <w:r>
+        <w:t>B.3 Migration SQL — accounts, KYC, screening</w:t>
+      </w:r>
+    </w:p>
+    <w:p>
+      <w:pPr>
+        <w:spacing w:after="120"/>
+        <w:ind w:left="240"/>
+      </w:pPr>
+      <w:r>
+        <w:rPr>
+          <w:rFonts w:ascii="Consolas" w:hAnsi="Consolas"/>
+          <w:sz w:val="17"/>
+        </w:rPr>
+        <w:t>-- B.3.1  Custodial crypto accounts / deposit addresses (issued by partner)</w:t>
+      </w:r>
+      <w:r>
+        <w:rPr>
+          <w:rFonts w:ascii="Consolas" w:hAnsi="Consolas"/>
+          <w:sz w:val="17"/>
+        </w:rPr>
+        <w:br/>
+      </w:r>
+      <w:r>
+        <w:rPr>
+          <w:rFonts w:ascii="Consolas" w:hAnsi="Consolas"/>
+          <w:sz w:val="17"/>
+        </w:rPr>
+        <w:t>CREATE TABLE crypto_accounts (</w:t>
+      </w:r>
+      <w:r>
+        <w:rPr>
+          <w:rFonts w:ascii="Consolas" w:hAnsi="Consolas"/>
+          <w:sz w:val="17"/>
+        </w:rPr>
+        <w:br/>
+      </w:r>
+      <w:r>
+        <w:rPr>
+          <w:rFonts w:ascii="Consolas" w:hAnsi="Consolas"/>
+          <w:sz w:val="17"/>
+        </w:rPr>
+        <w:t xml:space="preserve">    id                 VARCHAR(36)  PRIMARY KEY,</w:t>
+      </w:r>
+      <w:r>
+        <w:rPr>
+          <w:rFonts w:ascii="Consolas" w:hAnsi="Consolas"/>
+          <w:sz w:val="17"/>
+        </w:rPr>
+        <w:br/>
+      </w:r>
+      <w:r>
+        <w:rPr>
+          <w:rFonts w:ascii="Consolas" w:hAnsi="Consolas"/>
+          <w:sz w:val="17"/>
+        </w:rPr>
+        <w:t xml:space="preserve">    user_id            VARCHAR(36)  REFERENCES users(id),</w:t>
+      </w:r>
+      <w:r>
+        <w:rPr>
+          <w:rFonts w:ascii="Consolas" w:hAnsi="Consolas"/>
+          <w:sz w:val="17"/>
+        </w:rPr>
+        <w:br/>
+      </w:r>
+      <w:r>
+        <w:rPr>
+          <w:rFonts w:ascii="Consolas" w:hAnsi="Consolas"/>
+          <w:sz w:val="17"/>
+        </w:rPr>
+        <w:t xml:space="preserve">    merchant_id        VARCHAR(36)  REFERENCES merchants(id),</w:t>
+      </w:r>
+      <w:r>
+        <w:rPr>
+          <w:rFonts w:ascii="Consolas" w:hAnsi="Consolas"/>
+          <w:sz w:val="17"/>
+        </w:rPr>
+        <w:br/>
+      </w:r>
+      <w:r>
+        <w:rPr>
+          <w:rFonts w:ascii="Consolas" w:hAnsi="Consolas"/>
+          <w:sz w:val="17"/>
+        </w:rPr>
+        <w:t xml:space="preserve">    partner            VARCHAR(32)  NOT NULL,        -- 'zerohash'</w:t>
+      </w:r>
+      <w:r>
+        <w:rPr>
+          <w:rFonts w:ascii="Consolas" w:hAnsi="Consolas"/>
+          <w:sz w:val="17"/>
+        </w:rPr>
+        <w:br/>
+      </w:r>
+      <w:r>
+        <w:rPr>
+          <w:rFonts w:ascii="Consolas" w:hAnsi="Consolas"/>
+          <w:sz w:val="17"/>
+        </w:rPr>
+        <w:t xml:space="preserve">    partner_account_id VARCHAR(128) NOT NULL,</w:t>
+      </w:r>
+      <w:r>
+        <w:rPr>
+          <w:rFonts w:ascii="Consolas" w:hAnsi="Consolas"/>
+          <w:sz w:val="17"/>
+        </w:rPr>
+        <w:br/>
+      </w:r>
+      <w:r>
+        <w:rPr>
+          <w:rFonts w:ascii="Consolas" w:hAnsi="Consolas"/>
+          <w:sz w:val="17"/>
+        </w:rPr>
+        <w:t xml:space="preserve">    asset_code         VARCHAR(16)  NOT NULL REFERENCES assets(code),</w:t>
+      </w:r>
+      <w:r>
+        <w:rPr>
+          <w:rFonts w:ascii="Consolas" w:hAnsi="Consolas"/>
+          <w:sz w:val="17"/>
+        </w:rPr>
+        <w:br/>
+      </w:r>
+      <w:r>
+        <w:rPr>
+          <w:rFonts w:ascii="Consolas" w:hAnsi="Consolas"/>
+          <w:sz w:val="17"/>
+        </w:rPr>
+        <w:t xml:space="preserve">    network            VARCHAR(32)  NOT NULL,</w:t>
+      </w:r>
+      <w:r>
+        <w:rPr>
+          <w:rFonts w:ascii="Consolas" w:hAnsi="Consolas"/>
+          <w:sz w:val="17"/>
+        </w:rPr>
+        <w:br/>
+      </w:r>
+      <w:r>
+        <w:rPr>
+          <w:rFonts w:ascii="Consolas" w:hAnsi="Consolas"/>
+          <w:sz w:val="17"/>
+        </w:rPr>
+        <w:t xml:space="preserve">    deposit_address    VARCHAR(128),</w:t>
+      </w:r>
+      <w:r>
+        <w:rPr>
+          <w:rFonts w:ascii="Consolas" w:hAnsi="Consolas"/>
+          <w:sz w:val="17"/>
+        </w:rPr>
+        <w:br/>
+      </w:r>
+      <w:r>
+        <w:rPr>
+          <w:rFonts w:ascii="Consolas" w:hAnsi="Consolas"/>
+          <w:sz w:val="17"/>
+        </w:rPr>
+        <w:t xml:space="preserve">    status             VARCHAR(32)  NOT NULL DEFAULT 'pending', -- pending|active|frozen</w:t>
+      </w:r>
+      <w:r>
+        <w:rPr>
+          <w:rFonts w:ascii="Consolas" w:hAnsi="Consolas"/>
+          <w:sz w:val="17"/>
+        </w:rPr>
+        <w:br/>
+      </w:r>
+      <w:r>
+        <w:rPr>
+          <w:rFonts w:ascii="Consolas" w:hAnsi="Consolas"/>
+          <w:sz w:val="17"/>
+        </w:rPr>
+        <w:t xml:space="preserve">    created_at         TIMESTAMPTZ  NOT NULL DEFAULT now(),</w:t>
+      </w:r>
+      <w:r>
+        <w:rPr>
+          <w:rFonts w:ascii="Consolas" w:hAnsi="Consolas"/>
+          <w:sz w:val="17"/>
+        </w:rPr>
+        <w:br/>
+      </w:r>
+      <w:r>
+        <w:rPr>
+          <w:rFonts w:ascii="Consolas" w:hAnsi="Consolas"/>
+          <w:sz w:val="17"/>
+        </w:rPr>
+        <w:t xml:space="preserve">    updated_at         TIMESTAMPTZ  NOT NULL DEFAULT now(),</w:t>
+      </w:r>
+      <w:r>
+        <w:rPr>
+          <w:rFonts w:ascii="Consolas" w:hAnsi="Consolas"/>
+          <w:sz w:val="17"/>
+        </w:rPr>
+        <w:br/>
+      </w:r>
+      <w:r>
+        <w:rPr>
+          <w:rFonts w:ascii="Consolas" w:hAnsi="Consolas"/>
+          <w:sz w:val="17"/>
+        </w:rPr>
+        <w:t xml:space="preserve">    UNIQUE (partner, partner_account_id, asset_code, network)</w:t>
+      </w:r>
+      <w:r>
+        <w:rPr>
+          <w:rFonts w:ascii="Consolas" w:hAnsi="Consolas"/>
+          <w:sz w:val="17"/>
+        </w:rPr>
+        <w:br/>
+      </w:r>
+      <w:r>
+        <w:rPr>
+          <w:rFonts w:ascii="Consolas" w:hAnsi="Consolas"/>
+          <w:sz w:val="17"/>
+        </w:rPr>
+        <w:t>);</w:t>
+      </w:r>
+      <w:r>
+        <w:rPr>
+          <w:rFonts w:ascii="Consolas" w:hAnsi="Consolas"/>
+          <w:sz w:val="17"/>
+        </w:rPr>
+        <w:br/>
+      </w:r>
+      <w:r>
+        <w:rPr>
+          <w:rFonts w:ascii="Consolas" w:hAnsi="Consolas"/>
+          <w:sz w:val="17"/>
+        </w:rPr>
+        <w:t>CREATE INDEX ix_crypto_accounts_user ON crypto_accounts(user_id);</w:t>
+      </w:r>
+      <w:r>
+        <w:rPr>
+          <w:rFonts w:ascii="Consolas" w:hAnsi="Consolas"/>
+          <w:sz w:val="17"/>
+        </w:rPr>
+        <w:br/>
+      </w:r>
+      <w:r>
+        <w:rPr>
+          <w:rFonts w:ascii="Consolas" w:hAnsi="Consolas"/>
+          <w:sz w:val="17"/>
+        </w:rPr>
+      </w:r>
+      <w:r>
+        <w:rPr>
+          <w:rFonts w:ascii="Consolas" w:hAnsi="Consolas"/>
+          <w:sz w:val="17"/>
+        </w:rPr>
+        <w:br/>
+      </w:r>
+      <w:r>
+        <w:rPr>
+          <w:rFonts w:ascii="Consolas" w:hAnsi="Consolas"/>
+          <w:sz w:val="17"/>
+        </w:rPr>
+        <w:t>-- B.3.2  KYC status (partner-driven); gates all crypto features</w:t>
+      </w:r>
+      <w:r>
+        <w:rPr>
+          <w:rFonts w:ascii="Consolas" w:hAnsi="Consolas"/>
+          <w:sz w:val="17"/>
+        </w:rPr>
+        <w:br/>
+      </w:r>
+      <w:r>
+        <w:rPr>
+          <w:rFonts w:ascii="Consolas" w:hAnsi="Consolas"/>
+          <w:sz w:val="17"/>
+        </w:rPr>
+        <w:t>CREATE TABLE kyc_records (</w:t>
+      </w:r>
+      <w:r>
+        <w:rPr>
+          <w:rFonts w:ascii="Consolas" w:hAnsi="Consolas"/>
+          <w:sz w:val="17"/>
+        </w:rPr>
+        <w:br/>
+      </w:r>
+      <w:r>
+        <w:rPr>
+          <w:rFonts w:ascii="Consolas" w:hAnsi="Consolas"/>
+          <w:sz w:val="17"/>
+        </w:rPr>
+        <w:t xml:space="preserve">    id             VARCHAR(36)  PRIMARY KEY,</w:t>
+      </w:r>
+      <w:r>
+        <w:rPr>
+          <w:rFonts w:ascii="Consolas" w:hAnsi="Consolas"/>
+          <w:sz w:val="17"/>
+        </w:rPr>
+        <w:br/>
+      </w:r>
+      <w:r>
+        <w:rPr>
+          <w:rFonts w:ascii="Consolas" w:hAnsi="Consolas"/>
+          <w:sz w:val="17"/>
+        </w:rPr>
+        <w:t xml:space="preserve">    user_id        VARCHAR(36)  NOT NULL REFERENCES users(id),</w:t>
+      </w:r>
+      <w:r>
+        <w:rPr>
+          <w:rFonts w:ascii="Consolas" w:hAnsi="Consolas"/>
+          <w:sz w:val="17"/>
+        </w:rPr>
+        <w:br/>
+      </w:r>
+      <w:r>
+        <w:rPr>
+          <w:rFonts w:ascii="Consolas" w:hAnsi="Consolas"/>
+          <w:sz w:val="17"/>
+        </w:rPr>
+        <w:t xml:space="preserve">    partner        VARCHAR(32)  NOT NULL,</w:t>
+      </w:r>
+      <w:r>
+        <w:rPr>
+          <w:rFonts w:ascii="Consolas" w:hAnsi="Consolas"/>
+          <w:sz w:val="17"/>
+        </w:rPr>
+        <w:br/>
+      </w:r>
+      <w:r>
+        <w:rPr>
+          <w:rFonts w:ascii="Consolas" w:hAnsi="Consolas"/>
+          <w:sz w:val="17"/>
+        </w:rPr>
+        <w:t xml:space="preserve">    partner_kyc_id VARCHAR(128),</w:t>
+      </w:r>
+      <w:r>
+        <w:rPr>
+          <w:rFonts w:ascii="Consolas" w:hAnsi="Consolas"/>
+          <w:sz w:val="17"/>
+        </w:rPr>
+        <w:br/>
+      </w:r>
+      <w:r>
+        <w:rPr>
+          <w:rFonts w:ascii="Consolas" w:hAnsi="Consolas"/>
+          <w:sz w:val="17"/>
+        </w:rPr>
+        <w:t xml:space="preserve">    status         VARCHAR(32)  NOT NULL DEFAULT 'not_started', -- not_started|pending|approved|rejected</w:t>
+      </w:r>
+      <w:r>
+        <w:rPr>
+          <w:rFonts w:ascii="Consolas" w:hAnsi="Consolas"/>
+          <w:sz w:val="17"/>
+        </w:rPr>
+        <w:br/>
+      </w:r>
+      <w:r>
+        <w:rPr>
+          <w:rFonts w:ascii="Consolas" w:hAnsi="Consolas"/>
+          <w:sz w:val="17"/>
+        </w:rPr>
+        <w:t xml:space="preserve">    reason         TEXT,</w:t>
+      </w:r>
+      <w:r>
+        <w:rPr>
+          <w:rFonts w:ascii="Consolas" w:hAnsi="Consolas"/>
+          <w:sz w:val="17"/>
+        </w:rPr>
+        <w:br/>
+      </w:r>
+      <w:r>
+        <w:rPr>
+          <w:rFonts w:ascii="Consolas" w:hAnsi="Consolas"/>
+          <w:sz w:val="17"/>
+        </w:rPr>
+        <w:t xml:space="preserve">    created_at     TIMESTAMPTZ  NOT NULL DEFAULT now(),</w:t>
+      </w:r>
+      <w:r>
+        <w:rPr>
+          <w:rFonts w:ascii="Consolas" w:hAnsi="Consolas"/>
+          <w:sz w:val="17"/>
+        </w:rPr>
+        <w:br/>
+      </w:r>
+      <w:r>
+        <w:rPr>
+          <w:rFonts w:ascii="Consolas" w:hAnsi="Consolas"/>
+          <w:sz w:val="17"/>
+        </w:rPr>
+        <w:t xml:space="preserve">    updated_at     TIMESTAMPTZ  NOT NULL DEFAULT now()</w:t>
+      </w:r>
+      <w:r>
+        <w:rPr>
+          <w:rFonts w:ascii="Consolas" w:hAnsi="Consolas"/>
+          <w:sz w:val="17"/>
+        </w:rPr>
+        <w:br/>
+      </w:r>
+      <w:r>
+        <w:rPr>
+          <w:rFonts w:ascii="Consolas" w:hAnsi="Consolas"/>
+          <w:sz w:val="17"/>
+        </w:rPr>
+        <w:t>);</w:t>
+      </w:r>
+      <w:r>
+        <w:rPr>
+          <w:rFonts w:ascii="Consolas" w:hAnsi="Consolas"/>
+          <w:sz w:val="17"/>
+        </w:rPr>
+        <w:br/>
+      </w:r>
+      <w:r>
+        <w:rPr>
+          <w:rFonts w:ascii="Consolas" w:hAnsi="Consolas"/>
+          <w:sz w:val="17"/>
+        </w:rPr>
+        <w:t>CREATE UNIQUE INDEX ux_kyc_user ON kyc_records(user_id);</w:t>
+      </w:r>
+      <w:r>
+        <w:rPr>
+          <w:rFonts w:ascii="Consolas" w:hAnsi="Consolas"/>
+          <w:sz w:val="17"/>
+        </w:rPr>
+        <w:br/>
+      </w:r>
+      <w:r>
+        <w:rPr>
+          <w:rFonts w:ascii="Consolas" w:hAnsi="Consolas"/>
+          <w:sz w:val="17"/>
+        </w:rPr>
+      </w:r>
+      <w:r>
+        <w:rPr>
+          <w:rFonts w:ascii="Consolas" w:hAnsi="Consolas"/>
+          <w:sz w:val="17"/>
+        </w:rPr>
+        <w:br/>
+      </w:r>
+      <w:r>
+        <w:rPr>
+          <w:rFonts w:ascii="Consolas" w:hAnsi="Consolas"/>
+          <w:sz w:val="17"/>
+        </w:rPr>
+        <w:t>-- B.3.3  Sanctions / KYT screening results (audit evidence)</w:t>
+      </w:r>
+      <w:r>
+        <w:rPr>
+          <w:rFonts w:ascii="Consolas" w:hAnsi="Consolas"/>
+          <w:sz w:val="17"/>
+        </w:rPr>
+        <w:br/>
+      </w:r>
+      <w:r>
+        <w:rPr>
+          <w:rFonts w:ascii="Consolas" w:hAnsi="Consolas"/>
+          <w:sz w:val="17"/>
+        </w:rPr>
+        <w:t>CREATE TABLE sanctions_screening (</w:t>
+      </w:r>
+      <w:r>
+        <w:rPr>
+          <w:rFonts w:ascii="Consolas" w:hAnsi="Consolas"/>
+          <w:sz w:val="17"/>
+        </w:rPr>
+        <w:br/>
+      </w:r>
+      <w:r>
+        <w:rPr>
+          <w:rFonts w:ascii="Consolas" w:hAnsi="Consolas"/>
+          <w:sz w:val="17"/>
+        </w:rPr>
+        <w:t xml:space="preserve">    id             VARCHAR(36)  PRIMARY KEY,</w:t>
+      </w:r>
+      <w:r>
+        <w:rPr>
+          <w:rFonts w:ascii="Consolas" w:hAnsi="Consolas"/>
+          <w:sz w:val="17"/>
+        </w:rPr>
+        <w:br/>
+      </w:r>
+      <w:r>
+        <w:rPr>
+          <w:rFonts w:ascii="Consolas" w:hAnsi="Consolas"/>
+          <w:sz w:val="17"/>
+        </w:rPr>
+        <w:t xml:space="preserve">    transaction_id VARCHAR(36)  REFERENCES transactions(id),</w:t>
+      </w:r>
+      <w:r>
+        <w:rPr>
+          <w:rFonts w:ascii="Consolas" w:hAnsi="Consolas"/>
+          <w:sz w:val="17"/>
+        </w:rPr>
+        <w:br/>
+      </w:r>
+      <w:r>
+        <w:rPr>
+          <w:rFonts w:ascii="Consolas" w:hAnsi="Consolas"/>
+          <w:sz w:val="17"/>
+        </w:rPr>
+        <w:t xml:space="preserve">    address        VARCHAR(128),</w:t>
+      </w:r>
+      <w:r>
+        <w:rPr>
+          <w:rFonts w:ascii="Consolas" w:hAnsi="Consolas"/>
+          <w:sz w:val="17"/>
+        </w:rPr>
+        <w:br/>
+      </w:r>
+      <w:r>
+        <w:rPr>
+          <w:rFonts w:ascii="Consolas" w:hAnsi="Consolas"/>
+          <w:sz w:val="17"/>
+        </w:rPr>
+        <w:t xml:space="preserve">    provider       VARCHAR(32)  NOT NULL,          -- 'chainalysis','trm','elliptic'</w:t>
+      </w:r>
+      <w:r>
+        <w:rPr>
+          <w:rFonts w:ascii="Consolas" w:hAnsi="Consolas"/>
+          <w:sz w:val="17"/>
+        </w:rPr>
+        <w:br/>
+      </w:r>
+      <w:r>
+        <w:rPr>
+          <w:rFonts w:ascii="Consolas" w:hAnsi="Consolas"/>
+          <w:sz w:val="17"/>
+        </w:rPr>
+        <w:t xml:space="preserve">    result         VARCHAR(32)  NOT NULL,          -- 'pass','review','block'</w:t>
+      </w:r>
+      <w:r>
+        <w:rPr>
+          <w:rFonts w:ascii="Consolas" w:hAnsi="Consolas"/>
+          <w:sz w:val="17"/>
+        </w:rPr>
+        <w:br/>
+      </w:r>
+      <w:r>
+        <w:rPr>
+          <w:rFonts w:ascii="Consolas" w:hAnsi="Consolas"/>
+          <w:sz w:val="17"/>
+        </w:rPr>
+        <w:t xml:space="preserve">    risk_score     NUMERIC(6,2),</w:t>
+      </w:r>
+      <w:r>
+        <w:rPr>
+          <w:rFonts w:ascii="Consolas" w:hAnsi="Consolas"/>
+          <w:sz w:val="17"/>
+        </w:rPr>
+        <w:br/>
+      </w:r>
+      <w:r>
+        <w:rPr>
+          <w:rFonts w:ascii="Consolas" w:hAnsi="Consolas"/>
+          <w:sz w:val="17"/>
+        </w:rPr>
+        <w:t xml:space="preserve">    raw_payload    TEXT,</w:t>
+      </w:r>
+      <w:r>
+        <w:rPr>
+          <w:rFonts w:ascii="Consolas" w:hAnsi="Consolas"/>
+          <w:sz w:val="17"/>
+        </w:rPr>
+        <w:br/>
+      </w:r>
+      <w:r>
+        <w:rPr>
+          <w:rFonts w:ascii="Consolas" w:hAnsi="Consolas"/>
+          <w:sz w:val="17"/>
+        </w:rPr>
+        <w:t xml:space="preserve">    screened_at    TIMESTAMPTZ  NOT NULL DEFAULT now()</w:t>
+      </w:r>
+      <w:r>
+        <w:rPr>
+          <w:rFonts w:ascii="Consolas" w:hAnsi="Consolas"/>
+          <w:sz w:val="17"/>
+        </w:rPr>
+        <w:br/>
+      </w:r>
+      <w:r>
+        <w:rPr>
+          <w:rFonts w:ascii="Consolas" w:hAnsi="Consolas"/>
+          <w:sz w:val="17"/>
+        </w:rPr>
+        <w:t>);</w:t>
+      </w:r>
+      <w:r>
+        <w:rPr>
+          <w:rFonts w:ascii="Consolas" w:hAnsi="Consolas"/>
+          <w:sz w:val="17"/>
+        </w:rPr>
+        <w:br/>
+      </w:r>
+      <w:r>
+        <w:rPr>
+          <w:rFonts w:ascii="Consolas" w:hAnsi="Consolas"/>
+          <w:sz w:val="17"/>
+        </w:rPr>
+        <w:t>CREATE INDEX ix_screening_tx ON sanctions_screening(transaction_id);</w:t>
+      </w:r>
+    </w:p>
+    <w:p>
+      <w:pPr>
+        <w:pStyle w:val="Heading2"/>
+      </w:pPr>
+      <w:r>
+        <w:t>B.4 Migration SQL — ledger (multi-asset + base-unit precision)</w:t>
+      </w:r>
+    </w:p>
+    <w:p>
+      <w:pPr>
+        <w:spacing w:after="120"/>
+        <w:ind w:left="240"/>
+      </w:pPr>
+      <w:r>
+        <w:rPr>
+          <w:rFonts w:ascii="Consolas" w:hAnsi="Consolas"/>
+          <w:sz w:val="17"/>
+        </w:rPr>
+        <w:t>-- Add asset scope and integer base-unit columns; backfill existing USD rows.</w:t>
+      </w:r>
+      <w:r>
+        <w:rPr>
+          <w:rFonts w:ascii="Consolas" w:hAnsi="Consolas"/>
+          <w:sz w:val="17"/>
+        </w:rPr>
+        <w:br/>
+      </w:r>
+      <w:r>
+        <w:rPr>
+          <w:rFonts w:ascii="Consolas" w:hAnsi="Consolas"/>
+          <w:sz w:val="17"/>
+        </w:rPr>
+        <w:t>ALTER TABLE ledger ADD COLUMN asset_code VARCHAR(16) NOT NULL DEFAULT 'USD'</w:t>
+      </w:r>
+      <w:r>
+        <w:rPr>
+          <w:rFonts w:ascii="Consolas" w:hAnsi="Consolas"/>
+          <w:sz w:val="17"/>
+        </w:rPr>
+        <w:br/>
+      </w:r>
+      <w:r>
+        <w:rPr>
+          <w:rFonts w:ascii="Consolas" w:hAnsi="Consolas"/>
+          <w:sz w:val="17"/>
+        </w:rPr>
+        <w:t xml:space="preserve">    REFERENCES assets(code);</w:t>
+      </w:r>
+      <w:r>
+        <w:rPr>
+          <w:rFonts w:ascii="Consolas" w:hAnsi="Consolas"/>
+          <w:sz w:val="17"/>
+        </w:rPr>
+        <w:br/>
+      </w:r>
+      <w:r>
+        <w:rPr>
+          <w:rFonts w:ascii="Consolas" w:hAnsi="Consolas"/>
+          <w:sz w:val="17"/>
+        </w:rPr>
+        <w:t>ALTER TABLE ledger ADD COLUMN amount_base_units        NUMERIC(38,0);</w:t>
+      </w:r>
+      <w:r>
+        <w:rPr>
+          <w:rFonts w:ascii="Consolas" w:hAnsi="Consolas"/>
+          <w:sz w:val="17"/>
+        </w:rPr>
+        <w:br/>
+      </w:r>
+      <w:r>
+        <w:rPr>
+          <w:rFonts w:ascii="Consolas" w:hAnsi="Consolas"/>
+          <w:sz w:val="17"/>
+        </w:rPr>
+        <w:t>ALTER TABLE ledger ADD COLUMN balance_after_base_units NUMERIC(38,0);</w:t>
+      </w:r>
+      <w:r>
+        <w:rPr>
+          <w:rFonts w:ascii="Consolas" w:hAnsi="Consolas"/>
+          <w:sz w:val="17"/>
+        </w:rPr>
+        <w:br/>
+      </w:r>
+      <w:r>
+        <w:rPr>
+          <w:rFonts w:ascii="Consolas" w:hAnsi="Consolas"/>
+          <w:sz w:val="17"/>
+        </w:rPr>
+      </w:r>
+      <w:r>
+        <w:rPr>
+          <w:rFonts w:ascii="Consolas" w:hAnsi="Consolas"/>
+          <w:sz w:val="17"/>
+        </w:rPr>
+        <w:br/>
+      </w:r>
+      <w:r>
+        <w:rPr>
+          <w:rFonts w:ascii="Consolas" w:hAnsi="Consolas"/>
+          <w:sz w:val="17"/>
+        </w:rPr>
+        <w:t>-- Backfill: 2-decimal Decimal -&gt; base units (x100) for existing USD ledger rows</w:t>
+      </w:r>
+      <w:r>
+        <w:rPr>
+          <w:rFonts w:ascii="Consolas" w:hAnsi="Consolas"/>
+          <w:sz w:val="17"/>
+        </w:rPr>
+        <w:br/>
+      </w:r>
+      <w:r>
+        <w:rPr>
+          <w:rFonts w:ascii="Consolas" w:hAnsi="Consolas"/>
+          <w:sz w:val="17"/>
+        </w:rPr>
+        <w:t>UPDATE ledger</w:t>
+      </w:r>
+      <w:r>
+        <w:rPr>
+          <w:rFonts w:ascii="Consolas" w:hAnsi="Consolas"/>
+          <w:sz w:val="17"/>
+        </w:rPr>
+        <w:br/>
+      </w:r>
+      <w:r>
+        <w:rPr>
+          <w:rFonts w:ascii="Consolas" w:hAnsi="Consolas"/>
+          <w:sz w:val="17"/>
+        </w:rPr>
+        <w:t xml:space="preserve">   SET amount_base_units        = ROUND(amount * 100),</w:t>
+      </w:r>
+      <w:r>
+        <w:rPr>
+          <w:rFonts w:ascii="Consolas" w:hAnsi="Consolas"/>
+          <w:sz w:val="17"/>
+        </w:rPr>
+        <w:br/>
+      </w:r>
+      <w:r>
+        <w:rPr>
+          <w:rFonts w:ascii="Consolas" w:hAnsi="Consolas"/>
+          <w:sz w:val="17"/>
+        </w:rPr>
+        <w:t xml:space="preserve">       balance_after_base_units = ROUND(balance_after * 100)</w:t>
+      </w:r>
+      <w:r>
+        <w:rPr>
+          <w:rFonts w:ascii="Consolas" w:hAnsi="Consolas"/>
+          <w:sz w:val="17"/>
+        </w:rPr>
+        <w:br/>
+      </w:r>
+      <w:r>
+        <w:rPr>
+          <w:rFonts w:ascii="Consolas" w:hAnsi="Consolas"/>
+          <w:sz w:val="17"/>
+        </w:rPr>
+        <w:t xml:space="preserve"> WHERE asset_code = 'USD';</w:t>
+      </w:r>
+      <w:r>
+        <w:rPr>
+          <w:rFonts w:ascii="Consolas" w:hAnsi="Consolas"/>
+          <w:sz w:val="17"/>
+        </w:rPr>
+        <w:br/>
+      </w:r>
+      <w:r>
+        <w:rPr>
+          <w:rFonts w:ascii="Consolas" w:hAnsi="Consolas"/>
+          <w:sz w:val="17"/>
+        </w:rPr>
+      </w:r>
+      <w:r>
+        <w:rPr>
+          <w:rFonts w:ascii="Consolas" w:hAnsi="Consolas"/>
+          <w:sz w:val="17"/>
+        </w:rPr>
+        <w:br/>
+      </w:r>
+      <w:r>
+        <w:rPr>
+          <w:rFonts w:ascii="Consolas" w:hAnsi="Consolas"/>
+          <w:sz w:val="17"/>
+        </w:rPr>
+        <w:t>-- After backfill, enforce NOT NULL; keep old Decimal cols during transition, drop later.</w:t>
+      </w:r>
+      <w:r>
+        <w:rPr>
+          <w:rFonts w:ascii="Consolas" w:hAnsi="Consolas"/>
+          <w:sz w:val="17"/>
+        </w:rPr>
+        <w:br/>
+      </w:r>
+      <w:r>
+        <w:rPr>
+          <w:rFonts w:ascii="Consolas" w:hAnsi="Consolas"/>
+          <w:sz w:val="17"/>
+        </w:rPr>
+        <w:t>ALTER TABLE ledger ALTER COLUMN amount_base_units        SET NOT NULL;</w:t>
+      </w:r>
+      <w:r>
+        <w:rPr>
+          <w:rFonts w:ascii="Consolas" w:hAnsi="Consolas"/>
+          <w:sz w:val="17"/>
+        </w:rPr>
+        <w:br/>
+      </w:r>
+      <w:r>
+        <w:rPr>
+          <w:rFonts w:ascii="Consolas" w:hAnsi="Consolas"/>
+          <w:sz w:val="17"/>
+        </w:rPr>
+        <w:t>ALTER TABLE ledger ALTER COLUMN balance_after_base_units SET NOT NULL;</w:t>
+      </w:r>
+      <w:r>
+        <w:rPr>
+          <w:rFonts w:ascii="Consolas" w:hAnsi="Consolas"/>
+          <w:sz w:val="17"/>
+        </w:rPr>
+        <w:br/>
+      </w:r>
+      <w:r>
+        <w:rPr>
+          <w:rFonts w:ascii="Consolas" w:hAnsi="Consolas"/>
+          <w:sz w:val="17"/>
+        </w:rPr>
+      </w:r>
+      <w:r>
+        <w:rPr>
+          <w:rFonts w:ascii="Consolas" w:hAnsi="Consolas"/>
+          <w:sz w:val="17"/>
+        </w:rPr>
+        <w:br/>
+      </w:r>
+      <w:r>
+        <w:rPr>
+          <w:rFonts w:ascii="Consolas" w:hAnsi="Consolas"/>
+          <w:sz w:val="17"/>
+        </w:rPr>
+        <w:t>-- Current balance = balance_after_base_units of the most recent row per (owner, asset).</w:t>
+      </w:r>
+      <w:r>
+        <w:rPr>
+          <w:rFonts w:ascii="Consolas" w:hAnsi="Consolas"/>
+          <w:sz w:val="17"/>
+        </w:rPr>
+        <w:br/>
+      </w:r>
+      <w:r>
+        <w:rPr>
+          <w:rFonts w:ascii="Consolas" w:hAnsi="Consolas"/>
+          <w:sz w:val="17"/>
+        </w:rPr>
+        <w:t>CREATE INDEX ix_ledger_owner_asset</w:t>
+      </w:r>
+      <w:r>
+        <w:rPr>
+          <w:rFonts w:ascii="Consolas" w:hAnsi="Consolas"/>
+          <w:sz w:val="17"/>
+        </w:rPr>
+        <w:br/>
+      </w:r>
+      <w:r>
+        <w:rPr>
+          <w:rFonts w:ascii="Consolas" w:hAnsi="Consolas"/>
+          <w:sz w:val="17"/>
+        </w:rPr>
+        <w:t xml:space="preserve">    ON ledger (merchant_id, user_id, asset_code, created_at DESC);</w:t>
+      </w:r>
+    </w:p>
+    <w:p>
+      <w:pPr>
+        <w:pStyle w:val="Heading2"/>
+      </w:pPr>
+      <w:r>
+        <w:t>B.5 Migration SQL — transactions (asset + on-chain settlement)</w:t>
+      </w:r>
+    </w:p>
+    <w:p>
+      <w:pPr>
+        <w:spacing w:after="120"/>
+        <w:ind w:left="240"/>
+      </w:pPr>
+      <w:r>
+        <w:rPr>
+          <w:rFonts w:ascii="Consolas" w:hAnsi="Consolas"/>
+          <w:sz w:val="17"/>
+        </w:rPr>
+        <w:t>ALTER TABLE transactions ADD COLUMN asset_code VARCHAR(16) NOT NULL DEFAULT 'USD'</w:t>
+      </w:r>
+      <w:r>
+        <w:rPr>
+          <w:rFonts w:ascii="Consolas" w:hAnsi="Consolas"/>
+          <w:sz w:val="17"/>
+        </w:rPr>
+        <w:br/>
+      </w:r>
+      <w:r>
+        <w:rPr>
+          <w:rFonts w:ascii="Consolas" w:hAnsi="Consolas"/>
+          <w:sz w:val="17"/>
+        </w:rPr>
+        <w:t xml:space="preserve">    REFERENCES assets(code);</w:t>
+      </w:r>
+      <w:r>
+        <w:rPr>
+          <w:rFonts w:ascii="Consolas" w:hAnsi="Consolas"/>
+          <w:sz w:val="17"/>
+        </w:rPr>
+        <w:br/>
+      </w:r>
+      <w:r>
+        <w:rPr>
+          <w:rFonts w:ascii="Consolas" w:hAnsi="Consolas"/>
+          <w:sz w:val="17"/>
+        </w:rPr>
+        <w:t>ALTER TABLE transactions ADD COLUMN amount_base_units   NUMERIC(38,0);</w:t>
+      </w:r>
+      <w:r>
+        <w:rPr>
+          <w:rFonts w:ascii="Consolas" w:hAnsi="Consolas"/>
+          <w:sz w:val="17"/>
+        </w:rPr>
+        <w:br/>
+      </w:r>
+      <w:r>
+        <w:rPr>
+          <w:rFonts w:ascii="Consolas" w:hAnsi="Consolas"/>
+          <w:sz w:val="17"/>
+        </w:rPr>
+        <w:t>ALTER TABLE transactions ADD COLUMN settlement_type     VARCHAR(16) NOT NULL DEFAULT 'offchain'; -- offchain|onchain</w:t>
+      </w:r>
+      <w:r>
+        <w:rPr>
+          <w:rFonts w:ascii="Consolas" w:hAnsi="Consolas"/>
+          <w:sz w:val="17"/>
+        </w:rPr>
+        <w:br/>
+      </w:r>
+      <w:r>
+        <w:rPr>
+          <w:rFonts w:ascii="Consolas" w:hAnsi="Consolas"/>
+          <w:sz w:val="17"/>
+        </w:rPr>
+        <w:t>ALTER TABLE transactions ADD COLUMN settlement_network  VARCHAR(32);   -- 'ethereum','solana','bnb'</w:t>
+      </w:r>
+      <w:r>
+        <w:rPr>
+          <w:rFonts w:ascii="Consolas" w:hAnsi="Consolas"/>
+          <w:sz w:val="17"/>
+        </w:rPr>
+        <w:br/>
+      </w:r>
+      <w:r>
+        <w:rPr>
+          <w:rFonts w:ascii="Consolas" w:hAnsi="Consolas"/>
+          <w:sz w:val="17"/>
+        </w:rPr>
+        <w:t>ALTER TABLE transactions ADD COLUMN onchain_tx_hash     VARCHAR(128);</w:t>
+      </w:r>
+      <w:r>
+        <w:rPr>
+          <w:rFonts w:ascii="Consolas" w:hAnsi="Consolas"/>
+          <w:sz w:val="17"/>
+        </w:rPr>
+        <w:br/>
+      </w:r>
+      <w:r>
+        <w:rPr>
+          <w:rFonts w:ascii="Consolas" w:hAnsi="Consolas"/>
+          <w:sz w:val="17"/>
+        </w:rPr>
+        <w:t>ALTER TABLE transactions ADD COLUMN onchain_status      VARCHAR(24);   -- submitted|confirming|confirmed|failed|reorged</w:t>
+      </w:r>
+      <w:r>
+        <w:rPr>
+          <w:rFonts w:ascii="Consolas" w:hAnsi="Consolas"/>
+          <w:sz w:val="17"/>
+        </w:rPr>
+        <w:br/>
+      </w:r>
+      <w:r>
+        <w:rPr>
+          <w:rFonts w:ascii="Consolas" w:hAnsi="Consolas"/>
+          <w:sz w:val="17"/>
+        </w:rPr>
+        <w:t>ALTER TABLE transactions ADD COLUMN confirmations       INTEGER DEFAULT 0;</w:t>
+      </w:r>
+      <w:r>
+        <w:rPr>
+          <w:rFonts w:ascii="Consolas" w:hAnsi="Consolas"/>
+          <w:sz w:val="17"/>
+        </w:rPr>
+        <w:br/>
+      </w:r>
+      <w:r>
+        <w:rPr>
+          <w:rFonts w:ascii="Consolas" w:hAnsi="Consolas"/>
+          <w:sz w:val="17"/>
+        </w:rPr>
+        <w:t>ALTER TABLE transactions ADD COLUMN partner             VARCHAR(32);</w:t>
+      </w:r>
+      <w:r>
+        <w:rPr>
+          <w:rFonts w:ascii="Consolas" w:hAnsi="Consolas"/>
+          <w:sz w:val="17"/>
+        </w:rPr>
+        <w:br/>
+      </w:r>
+      <w:r>
+        <w:rPr>
+          <w:rFonts w:ascii="Consolas" w:hAnsi="Consolas"/>
+          <w:sz w:val="17"/>
+        </w:rPr>
+        <w:t>ALTER TABLE transactions ADD COLUMN partner_transfer_id VARCHAR(128);</w:t>
+      </w:r>
+      <w:r>
+        <w:rPr>
+          <w:rFonts w:ascii="Consolas" w:hAnsi="Consolas"/>
+          <w:sz w:val="17"/>
+        </w:rPr>
+        <w:br/>
+      </w:r>
+      <w:r>
+        <w:rPr>
+          <w:rFonts w:ascii="Consolas" w:hAnsi="Consolas"/>
+          <w:sz w:val="17"/>
+        </w:rPr>
+        <w:t>ALTER TABLE transactions ADD COLUMN direction           VARCHAR(24);   -- onramp|offramp|send|deposit|withdrawal</w:t>
+      </w:r>
+      <w:r>
+        <w:rPr>
+          <w:rFonts w:ascii="Consolas" w:hAnsi="Consolas"/>
+          <w:sz w:val="17"/>
+        </w:rPr>
+        <w:br/>
+      </w:r>
+      <w:r>
+        <w:rPr>
+          <w:rFonts w:ascii="Consolas" w:hAnsi="Consolas"/>
+          <w:sz w:val="17"/>
+        </w:rPr>
+      </w:r>
+      <w:r>
+        <w:rPr>
+          <w:rFonts w:ascii="Consolas" w:hAnsi="Consolas"/>
+          <w:sz w:val="17"/>
+        </w:rPr>
+        <w:br/>
+      </w:r>
+      <w:r>
+        <w:rPr>
+          <w:rFonts w:ascii="Consolas" w:hAnsi="Consolas"/>
+          <w:sz w:val="17"/>
+        </w:rPr>
+        <w:t>CREATE UNIQUE INDEX ux_tx_onchain_hash</w:t>
+      </w:r>
+      <w:r>
+        <w:rPr>
+          <w:rFonts w:ascii="Consolas" w:hAnsi="Consolas"/>
+          <w:sz w:val="17"/>
+        </w:rPr>
+        <w:br/>
+      </w:r>
+      <w:r>
+        <w:rPr>
+          <w:rFonts w:ascii="Consolas" w:hAnsi="Consolas"/>
+          <w:sz w:val="17"/>
+        </w:rPr>
+        <w:t xml:space="preserve">    ON transactions(onchain_tx_hash) WHERE onchain_tx_hash IS NOT NULL;</w:t>
+      </w:r>
+      <w:r>
+        <w:rPr>
+          <w:rFonts w:ascii="Consolas" w:hAnsi="Consolas"/>
+          <w:sz w:val="17"/>
+        </w:rPr>
+        <w:br/>
+      </w:r>
+      <w:r>
+        <w:rPr>
+          <w:rFonts w:ascii="Consolas" w:hAnsi="Consolas"/>
+          <w:sz w:val="17"/>
+        </w:rPr>
+        <w:t>CREATE INDEX ix_tx_partner_transfer ON transactions(partner_transfer_id);</w:t>
+      </w:r>
+    </w:p>
+    <w:p>
+      <w:pPr>
+        <w:pStyle w:val="Heading2"/>
+      </w:pPr>
+      <w:r>
+        <w:t>B.6 SQLAlchemy Model Sketch (representative)</w:t>
+      </w:r>
+    </w:p>
+    <w:p>
+      <w:r>
+        <w:t>Existing models live under app/models/ on a shared declarative Base. New models follow the same pattern; example for the custodial account:</w:t>
+      </w:r>
+    </w:p>
+    <w:p>
+      <w:pPr>
+        <w:spacing w:after="120"/>
+        <w:ind w:left="240"/>
+      </w:pPr>
+      <w:r>
+        <w:rPr>
+          <w:rFonts w:ascii="Consolas" w:hAnsi="Consolas"/>
+          <w:sz w:val="17"/>
+        </w:rPr>
+        <w:t># app/models/crypto_account.py</w:t>
+      </w:r>
+      <w:r>
+        <w:rPr>
+          <w:rFonts w:ascii="Consolas" w:hAnsi="Consolas"/>
+          <w:sz w:val="17"/>
+        </w:rPr>
+        <w:br/>
+      </w:r>
+      <w:r>
+        <w:rPr>
+          <w:rFonts w:ascii="Consolas" w:hAnsi="Consolas"/>
+          <w:sz w:val="17"/>
+        </w:rPr>
+        <w:t>from sqlalchemy import Column, String, DateTime, func</w:t>
+      </w:r>
+      <w:r>
+        <w:rPr>
+          <w:rFonts w:ascii="Consolas" w:hAnsi="Consolas"/>
+          <w:sz w:val="17"/>
+        </w:rPr>
+        <w:br/>
+      </w:r>
+      <w:r>
+        <w:rPr>
+          <w:rFonts w:ascii="Consolas" w:hAnsi="Consolas"/>
+          <w:sz w:val="17"/>
+        </w:rPr>
+        <w:t>from app.database import Base</w:t>
+      </w:r>
+      <w:r>
+        <w:rPr>
+          <w:rFonts w:ascii="Consolas" w:hAnsi="Consolas"/>
+          <w:sz w:val="17"/>
+        </w:rPr>
+        <w:br/>
+      </w:r>
+      <w:r>
+        <w:rPr>
+          <w:rFonts w:ascii="Consolas" w:hAnsi="Consolas"/>
+          <w:sz w:val="17"/>
+        </w:rPr>
+      </w:r>
+      <w:r>
+        <w:rPr>
+          <w:rFonts w:ascii="Consolas" w:hAnsi="Consolas"/>
+          <w:sz w:val="17"/>
+        </w:rPr>
+        <w:br/>
+      </w:r>
+      <w:r>
+        <w:rPr>
+          <w:rFonts w:ascii="Consolas" w:hAnsi="Consolas"/>
+          <w:sz w:val="17"/>
+        </w:rPr>
+        <w:t>class CryptoAccount(Base):</w:t>
+      </w:r>
+      <w:r>
+        <w:rPr>
+          <w:rFonts w:ascii="Consolas" w:hAnsi="Consolas"/>
+          <w:sz w:val="17"/>
+        </w:rPr>
+        <w:br/>
+      </w:r>
+      <w:r>
+        <w:rPr>
+          <w:rFonts w:ascii="Consolas" w:hAnsi="Consolas"/>
+          <w:sz w:val="17"/>
+        </w:rPr>
+        <w:t xml:space="preserve">    __tablename__ = "crypto_accounts"</w:t>
+      </w:r>
+      <w:r>
+        <w:rPr>
+          <w:rFonts w:ascii="Consolas" w:hAnsi="Consolas"/>
+          <w:sz w:val="17"/>
+        </w:rPr>
+        <w:br/>
+      </w:r>
+      <w:r>
+        <w:rPr>
+          <w:rFonts w:ascii="Consolas" w:hAnsi="Consolas"/>
+          <w:sz w:val="17"/>
+        </w:rPr>
+        <w:t xml:space="preserve">    id                 = Column(String(36), primary_key=True)</w:t>
+      </w:r>
+      <w:r>
+        <w:rPr>
+          <w:rFonts w:ascii="Consolas" w:hAnsi="Consolas"/>
+          <w:sz w:val="17"/>
+        </w:rPr>
+        <w:br/>
+      </w:r>
+      <w:r>
+        <w:rPr>
+          <w:rFonts w:ascii="Consolas" w:hAnsi="Consolas"/>
+          <w:sz w:val="17"/>
+        </w:rPr>
+        <w:t xml:space="preserve">    user_id            = Column(String(36), ForeignKey("users.id"), index=True)</w:t>
+      </w:r>
+      <w:r>
+        <w:rPr>
+          <w:rFonts w:ascii="Consolas" w:hAnsi="Consolas"/>
+          <w:sz w:val="17"/>
+        </w:rPr>
+        <w:br/>
+      </w:r>
+      <w:r>
+        <w:rPr>
+          <w:rFonts w:ascii="Consolas" w:hAnsi="Consolas"/>
+          <w:sz w:val="17"/>
+        </w:rPr>
+        <w:t xml:space="preserve">    merchant_id        = Column(String(36), ForeignKey("merchants.id"))</w:t>
+      </w:r>
+      <w:r>
+        <w:rPr>
+          <w:rFonts w:ascii="Consolas" w:hAnsi="Consolas"/>
+          <w:sz w:val="17"/>
+        </w:rPr>
+        <w:br/>
+      </w:r>
+      <w:r>
+        <w:rPr>
+          <w:rFonts w:ascii="Consolas" w:hAnsi="Consolas"/>
+          <w:sz w:val="17"/>
+        </w:rPr>
+        <w:t xml:space="preserve">    partner            = Column(String(32), nullable=False)          # 'zerohash'</w:t>
+      </w:r>
+      <w:r>
+        <w:rPr>
+          <w:rFonts w:ascii="Consolas" w:hAnsi="Consolas"/>
+          <w:sz w:val="17"/>
+        </w:rPr>
+        <w:br/>
+      </w:r>
+      <w:r>
+        <w:rPr>
+          <w:rFonts w:ascii="Consolas" w:hAnsi="Consolas"/>
+          <w:sz w:val="17"/>
+        </w:rPr>
+        <w:t xml:space="preserve">    partner_account_id = Column(String(128), nullable=False)</w:t>
+      </w:r>
+      <w:r>
+        <w:rPr>
+          <w:rFonts w:ascii="Consolas" w:hAnsi="Consolas"/>
+          <w:sz w:val="17"/>
+        </w:rPr>
+        <w:br/>
+      </w:r>
+      <w:r>
+        <w:rPr>
+          <w:rFonts w:ascii="Consolas" w:hAnsi="Consolas"/>
+          <w:sz w:val="17"/>
+        </w:rPr>
+        <w:t xml:space="preserve">    asset_code         = Column(String(16), ForeignKey("assets.code"), nullable=False)</w:t>
+      </w:r>
+      <w:r>
+        <w:rPr>
+          <w:rFonts w:ascii="Consolas" w:hAnsi="Consolas"/>
+          <w:sz w:val="17"/>
+        </w:rPr>
+        <w:br/>
+      </w:r>
+      <w:r>
+        <w:rPr>
+          <w:rFonts w:ascii="Consolas" w:hAnsi="Consolas"/>
+          <w:sz w:val="17"/>
+        </w:rPr>
+        <w:t xml:space="preserve">    network            = Column(String(32), nullable=False)</w:t>
+      </w:r>
+      <w:r>
+        <w:rPr>
+          <w:rFonts w:ascii="Consolas" w:hAnsi="Consolas"/>
+          <w:sz w:val="17"/>
+        </w:rPr>
+        <w:br/>
+      </w:r>
+      <w:r>
+        <w:rPr>
+          <w:rFonts w:ascii="Consolas" w:hAnsi="Consolas"/>
+          <w:sz w:val="17"/>
+        </w:rPr>
+        <w:t xml:space="preserve">    deposit_address    = Column(String(128))</w:t>
+      </w:r>
+      <w:r>
+        <w:rPr>
+          <w:rFonts w:ascii="Consolas" w:hAnsi="Consolas"/>
+          <w:sz w:val="17"/>
+        </w:rPr>
+        <w:br/>
+      </w:r>
+      <w:r>
+        <w:rPr>
+          <w:rFonts w:ascii="Consolas" w:hAnsi="Consolas"/>
+          <w:sz w:val="17"/>
+        </w:rPr>
+        <w:t xml:space="preserve">    status             = Column(String(32), nullable=False, default="pending")</w:t>
+      </w:r>
+      <w:r>
+        <w:rPr>
+          <w:rFonts w:ascii="Consolas" w:hAnsi="Consolas"/>
+          <w:sz w:val="17"/>
+        </w:rPr>
+        <w:br/>
+      </w:r>
+      <w:r>
+        <w:rPr>
+          <w:rFonts w:ascii="Consolas" w:hAnsi="Consolas"/>
+          <w:sz w:val="17"/>
+        </w:rPr>
+        <w:t xml:space="preserve">    created_at         = Column(DateTime(timezone=True), server_default=func.now())</w:t>
+      </w:r>
+      <w:r>
+        <w:rPr>
+          <w:rFonts w:ascii="Consolas" w:hAnsi="Consolas"/>
+          <w:sz w:val="17"/>
+        </w:rPr>
+        <w:br/>
+      </w:r>
+      <w:r>
+        <w:rPr>
+          <w:rFonts w:ascii="Consolas" w:hAnsi="Consolas"/>
+          <w:sz w:val="17"/>
+        </w:rPr>
+        <w:t xml:space="preserve">    updated_at         = Column(DateTime(timezone=True), server_default=func.now(), onupdate=func.now())</w:t>
+      </w:r>
+    </w:p>
+    <w:p>
+      <w:pPr>
+        <w:pStyle w:val="Heading2"/>
+      </w:pPr>
+      <w:r>
+        <w:t>B.7 StablecoinProviderInterface (Python)</w:t>
+      </w:r>
+    </w:p>
+    <w:p>
+      <w:r>
+        <w:t>Mirrors app/services/bank/interface.py so business logic stays provider-agnostic. A ZeroHashProvider implements it for production; a MockStablecoinProvider backs dev/tests (as mock_bank.py does today). Inject it via a FastAPI dependency, exactly like get_db.</w:t>
+      </w:r>
+    </w:p>
+    <w:p>
+      <w:pPr>
+        <w:spacing w:after="120"/>
+        <w:ind w:left="240"/>
+      </w:pPr>
+      <w:r>
+        <w:rPr>
+          <w:rFonts w:ascii="Consolas" w:hAnsi="Consolas"/>
+          <w:sz w:val="17"/>
+        </w:rPr>
+        <w:t># app/services/stablecoin/interface.py</w:t>
+      </w:r>
+      <w:r>
+        <w:rPr>
+          <w:rFonts w:ascii="Consolas" w:hAnsi="Consolas"/>
+          <w:sz w:val="17"/>
+        </w:rPr>
+        <w:br/>
+      </w:r>
+      <w:r>
+        <w:rPr>
+          <w:rFonts w:ascii="Consolas" w:hAnsi="Consolas"/>
+          <w:sz w:val="17"/>
+        </w:rPr>
+        <w:t>from __future__ import annotations</w:t>
+      </w:r>
+      <w:r>
+        <w:rPr>
+          <w:rFonts w:ascii="Consolas" w:hAnsi="Consolas"/>
+          <w:sz w:val="17"/>
+        </w:rPr>
+        <w:br/>
+      </w:r>
+      <w:r>
+        <w:rPr>
+          <w:rFonts w:ascii="Consolas" w:hAnsi="Consolas"/>
+          <w:sz w:val="17"/>
+        </w:rPr>
+        <w:t>from abc import ABC, abstractmethod</w:t>
+      </w:r>
+      <w:r>
+        <w:rPr>
+          <w:rFonts w:ascii="Consolas" w:hAnsi="Consolas"/>
+          <w:sz w:val="17"/>
+        </w:rPr>
+        <w:br/>
+      </w:r>
+      <w:r>
+        <w:rPr>
+          <w:rFonts w:ascii="Consolas" w:hAnsi="Consolas"/>
+          <w:sz w:val="17"/>
+        </w:rPr>
+        <w:t>from dataclasses import dataclass</w:t>
+      </w:r>
+      <w:r>
+        <w:rPr>
+          <w:rFonts w:ascii="Consolas" w:hAnsi="Consolas"/>
+          <w:sz w:val="17"/>
+        </w:rPr>
+        <w:br/>
+      </w:r>
+      <w:r>
+        <w:rPr>
+          <w:rFonts w:ascii="Consolas" w:hAnsi="Consolas"/>
+          <w:sz w:val="17"/>
+        </w:rPr>
+        <w:t>from decimal import Decimal</w:t>
+      </w:r>
+      <w:r>
+        <w:rPr>
+          <w:rFonts w:ascii="Consolas" w:hAnsi="Consolas"/>
+          <w:sz w:val="17"/>
+        </w:rPr>
+        <w:br/>
+      </w:r>
+      <w:r>
+        <w:rPr>
+          <w:rFonts w:ascii="Consolas" w:hAnsi="Consolas"/>
+          <w:sz w:val="17"/>
+        </w:rPr>
+        <w:t>from enum import Enum</w:t>
+      </w:r>
+      <w:r>
+        <w:rPr>
+          <w:rFonts w:ascii="Consolas" w:hAnsi="Consolas"/>
+          <w:sz w:val="17"/>
+        </w:rPr>
+        <w:br/>
+      </w:r>
+      <w:r>
+        <w:rPr>
+          <w:rFonts w:ascii="Consolas" w:hAnsi="Consolas"/>
+          <w:sz w:val="17"/>
+        </w:rPr>
+      </w:r>
+      <w:r>
+        <w:rPr>
+          <w:rFonts w:ascii="Consolas" w:hAnsi="Consolas"/>
+          <w:sz w:val="17"/>
+        </w:rPr>
+        <w:br/>
+      </w:r>
+      <w:r>
+        <w:rPr>
+          <w:rFonts w:ascii="Consolas" w:hAnsi="Consolas"/>
+          <w:sz w:val="17"/>
+        </w:rPr>
+      </w:r>
+      <w:r>
+        <w:rPr>
+          <w:rFonts w:ascii="Consolas" w:hAnsi="Consolas"/>
+          <w:sz w:val="17"/>
+        </w:rPr>
+        <w:br/>
+      </w:r>
+      <w:r>
+        <w:rPr>
+          <w:rFonts w:ascii="Consolas" w:hAnsi="Consolas"/>
+          <w:sz w:val="17"/>
+        </w:rPr>
+        <w:t>class OnchainStatus(str, Enum):</w:t>
+      </w:r>
+      <w:r>
+        <w:rPr>
+          <w:rFonts w:ascii="Consolas" w:hAnsi="Consolas"/>
+          <w:sz w:val="17"/>
+        </w:rPr>
+        <w:br/>
+      </w:r>
+      <w:r>
+        <w:rPr>
+          <w:rFonts w:ascii="Consolas" w:hAnsi="Consolas"/>
+          <w:sz w:val="17"/>
+        </w:rPr>
+        <w:t xml:space="preserve">    SUBMITTED = "submitted"; CONFIRMING = "confirming"; CONFIRMED = "confirmed"</w:t>
+      </w:r>
+      <w:r>
+        <w:rPr>
+          <w:rFonts w:ascii="Consolas" w:hAnsi="Consolas"/>
+          <w:sz w:val="17"/>
+        </w:rPr>
+        <w:br/>
+      </w:r>
+      <w:r>
+        <w:rPr>
+          <w:rFonts w:ascii="Consolas" w:hAnsi="Consolas"/>
+          <w:sz w:val="17"/>
+        </w:rPr>
+        <w:t xml:space="preserve">    FAILED = "failed"; REORGED = "reorged"</w:t>
+      </w:r>
+      <w:r>
+        <w:rPr>
+          <w:rFonts w:ascii="Consolas" w:hAnsi="Consolas"/>
+          <w:sz w:val="17"/>
+        </w:rPr>
+        <w:br/>
+      </w:r>
+      <w:r>
+        <w:rPr>
+          <w:rFonts w:ascii="Consolas" w:hAnsi="Consolas"/>
+          <w:sz w:val="17"/>
+        </w:rPr>
+      </w:r>
+      <w:r>
+        <w:rPr>
+          <w:rFonts w:ascii="Consolas" w:hAnsi="Consolas"/>
+          <w:sz w:val="17"/>
+        </w:rPr>
+        <w:br/>
+      </w:r>
+      <w:r>
+        <w:rPr>
+          <w:rFonts w:ascii="Consolas" w:hAnsi="Consolas"/>
+          <w:sz w:val="17"/>
+        </w:rPr>
+      </w:r>
+      <w:r>
+        <w:rPr>
+          <w:rFonts w:ascii="Consolas" w:hAnsi="Consolas"/>
+          <w:sz w:val="17"/>
+        </w:rPr>
+        <w:br/>
+      </w:r>
+      <w:r>
+        <w:rPr>
+          <w:rFonts w:ascii="Consolas" w:hAnsi="Consolas"/>
+          <w:sz w:val="17"/>
+        </w:rPr>
+        <w:t>class KycStatus(str, Enum):</w:t>
+      </w:r>
+      <w:r>
+        <w:rPr>
+          <w:rFonts w:ascii="Consolas" w:hAnsi="Consolas"/>
+          <w:sz w:val="17"/>
+        </w:rPr>
+        <w:br/>
+      </w:r>
+      <w:r>
+        <w:rPr>
+          <w:rFonts w:ascii="Consolas" w:hAnsi="Consolas"/>
+          <w:sz w:val="17"/>
+        </w:rPr>
+        <w:t xml:space="preserve">    NOT_STARTED = "not_started"; PENDING = "pending"</w:t>
+      </w:r>
+      <w:r>
+        <w:rPr>
+          <w:rFonts w:ascii="Consolas" w:hAnsi="Consolas"/>
+          <w:sz w:val="17"/>
+        </w:rPr>
+        <w:br/>
+      </w:r>
+      <w:r>
+        <w:rPr>
+          <w:rFonts w:ascii="Consolas" w:hAnsi="Consolas"/>
+          <w:sz w:val="17"/>
+        </w:rPr>
+        <w:t xml:space="preserve">    APPROVED = "approved"; REJECTED = "rejected"</w:t>
+      </w:r>
+      <w:r>
+        <w:rPr>
+          <w:rFonts w:ascii="Consolas" w:hAnsi="Consolas"/>
+          <w:sz w:val="17"/>
+        </w:rPr>
+        <w:br/>
+      </w:r>
+      <w:r>
+        <w:rPr>
+          <w:rFonts w:ascii="Consolas" w:hAnsi="Consolas"/>
+          <w:sz w:val="17"/>
+        </w:rPr>
+      </w:r>
+      <w:r>
+        <w:rPr>
+          <w:rFonts w:ascii="Consolas" w:hAnsi="Consolas"/>
+          <w:sz w:val="17"/>
+        </w:rPr>
+        <w:br/>
+      </w:r>
+      <w:r>
+        <w:rPr>
+          <w:rFonts w:ascii="Consolas" w:hAnsi="Consolas"/>
+          <w:sz w:val="17"/>
+        </w:rPr>
+      </w:r>
+      <w:r>
+        <w:rPr>
+          <w:rFonts w:ascii="Consolas" w:hAnsi="Consolas"/>
+          <w:sz w:val="17"/>
+        </w:rPr>
+        <w:br/>
+      </w:r>
+      <w:r>
+        <w:rPr>
+          <w:rFonts w:ascii="Consolas" w:hAnsi="Consolas"/>
+          <w:sz w:val="17"/>
+        </w:rPr>
+        <w:t>@dataclass</w:t>
+      </w:r>
+      <w:r>
+        <w:rPr>
+          <w:rFonts w:ascii="Consolas" w:hAnsi="Consolas"/>
+          <w:sz w:val="17"/>
+        </w:rPr>
+        <w:br/>
+      </w:r>
+      <w:r>
+        <w:rPr>
+          <w:rFonts w:ascii="Consolas" w:hAnsi="Consolas"/>
+          <w:sz w:val="17"/>
+        </w:rPr>
+        <w:t>class CryptoAccount:</w:t>
+      </w:r>
+      <w:r>
+        <w:rPr>
+          <w:rFonts w:ascii="Consolas" w:hAnsi="Consolas"/>
+          <w:sz w:val="17"/>
+        </w:rPr>
+        <w:br/>
+      </w:r>
+      <w:r>
+        <w:rPr>
+          <w:rFonts w:ascii="Consolas" w:hAnsi="Consolas"/>
+          <w:sz w:val="17"/>
+        </w:rPr>
+        <w:t xml:space="preserve">    partner_account_id: str</w:t>
+      </w:r>
+      <w:r>
+        <w:rPr>
+          <w:rFonts w:ascii="Consolas" w:hAnsi="Consolas"/>
+          <w:sz w:val="17"/>
+        </w:rPr>
+        <w:br/>
+      </w:r>
+      <w:r>
+        <w:rPr>
+          <w:rFonts w:ascii="Consolas" w:hAnsi="Consolas"/>
+          <w:sz w:val="17"/>
+        </w:rPr>
+        <w:t xml:space="preserve">    asset_code: str</w:t>
+      </w:r>
+      <w:r>
+        <w:rPr>
+          <w:rFonts w:ascii="Consolas" w:hAnsi="Consolas"/>
+          <w:sz w:val="17"/>
+        </w:rPr>
+        <w:br/>
+      </w:r>
+      <w:r>
+        <w:rPr>
+          <w:rFonts w:ascii="Consolas" w:hAnsi="Consolas"/>
+          <w:sz w:val="17"/>
+        </w:rPr>
+        <w:t xml:space="preserve">    network: str</w:t>
+      </w:r>
+      <w:r>
+        <w:rPr>
+          <w:rFonts w:ascii="Consolas" w:hAnsi="Consolas"/>
+          <w:sz w:val="17"/>
+        </w:rPr>
+        <w:br/>
+      </w:r>
+      <w:r>
+        <w:rPr>
+          <w:rFonts w:ascii="Consolas" w:hAnsi="Consolas"/>
+          <w:sz w:val="17"/>
+        </w:rPr>
+        <w:t xml:space="preserve">    deposit_address: str | None</w:t>
+      </w:r>
+      <w:r>
+        <w:rPr>
+          <w:rFonts w:ascii="Consolas" w:hAnsi="Consolas"/>
+          <w:sz w:val="17"/>
+        </w:rPr>
+        <w:br/>
+      </w:r>
+      <w:r>
+        <w:rPr>
+          <w:rFonts w:ascii="Consolas" w:hAnsi="Consolas"/>
+          <w:sz w:val="17"/>
+        </w:rPr>
+      </w:r>
+      <w:r>
+        <w:rPr>
+          <w:rFonts w:ascii="Consolas" w:hAnsi="Consolas"/>
+          <w:sz w:val="17"/>
+        </w:rPr>
+        <w:br/>
+      </w:r>
+      <w:r>
+        <w:rPr>
+          <w:rFonts w:ascii="Consolas" w:hAnsi="Consolas"/>
+          <w:sz w:val="17"/>
+        </w:rPr>
+      </w:r>
+      <w:r>
+        <w:rPr>
+          <w:rFonts w:ascii="Consolas" w:hAnsi="Consolas"/>
+          <w:sz w:val="17"/>
+        </w:rPr>
+        <w:br/>
+      </w:r>
+      <w:r>
+        <w:rPr>
+          <w:rFonts w:ascii="Consolas" w:hAnsi="Consolas"/>
+          <w:sz w:val="17"/>
+        </w:rPr>
+        <w:t>@dataclass</w:t>
+      </w:r>
+      <w:r>
+        <w:rPr>
+          <w:rFonts w:ascii="Consolas" w:hAnsi="Consolas"/>
+          <w:sz w:val="17"/>
+        </w:rPr>
+        <w:br/>
+      </w:r>
+      <w:r>
+        <w:rPr>
+          <w:rFonts w:ascii="Consolas" w:hAnsi="Consolas"/>
+          <w:sz w:val="17"/>
+        </w:rPr>
+        <w:t>class TransferResult:</w:t>
+      </w:r>
+      <w:r>
+        <w:rPr>
+          <w:rFonts w:ascii="Consolas" w:hAnsi="Consolas"/>
+          <w:sz w:val="17"/>
+        </w:rPr>
+        <w:br/>
+      </w:r>
+      <w:r>
+        <w:rPr>
+          <w:rFonts w:ascii="Consolas" w:hAnsi="Consolas"/>
+          <w:sz w:val="17"/>
+        </w:rPr>
+        <w:t xml:space="preserve">    partner_transfer_id: str</w:t>
+      </w:r>
+      <w:r>
+        <w:rPr>
+          <w:rFonts w:ascii="Consolas" w:hAnsi="Consolas"/>
+          <w:sz w:val="17"/>
+        </w:rPr>
+        <w:br/>
+      </w:r>
+      <w:r>
+        <w:rPr>
+          <w:rFonts w:ascii="Consolas" w:hAnsi="Consolas"/>
+          <w:sz w:val="17"/>
+        </w:rPr>
+        <w:t xml:space="preserve">    onchain_tx_hash: str | None</w:t>
+      </w:r>
+      <w:r>
+        <w:rPr>
+          <w:rFonts w:ascii="Consolas" w:hAnsi="Consolas"/>
+          <w:sz w:val="17"/>
+        </w:rPr>
+        <w:br/>
+      </w:r>
+      <w:r>
+        <w:rPr>
+          <w:rFonts w:ascii="Consolas" w:hAnsi="Consolas"/>
+          <w:sz w:val="17"/>
+        </w:rPr>
+        <w:t xml:space="preserve">    status: OnchainStatus</w:t>
+      </w:r>
+      <w:r>
+        <w:rPr>
+          <w:rFonts w:ascii="Consolas" w:hAnsi="Consolas"/>
+          <w:sz w:val="17"/>
+        </w:rPr>
+        <w:br/>
+      </w:r>
+      <w:r>
+        <w:rPr>
+          <w:rFonts w:ascii="Consolas" w:hAnsi="Consolas"/>
+          <w:sz w:val="17"/>
+        </w:rPr>
+        <w:t xml:space="preserve">    confirmations: int</w:t>
+      </w:r>
+      <w:r>
+        <w:rPr>
+          <w:rFonts w:ascii="Consolas" w:hAnsi="Consolas"/>
+          <w:sz w:val="17"/>
+        </w:rPr>
+        <w:br/>
+      </w:r>
+      <w:r>
+        <w:rPr>
+          <w:rFonts w:ascii="Consolas" w:hAnsi="Consolas"/>
+          <w:sz w:val="17"/>
+        </w:rPr>
+        <w:t xml:space="preserve">    failure_reason: str | None = None</w:t>
+      </w:r>
+      <w:r>
+        <w:rPr>
+          <w:rFonts w:ascii="Consolas" w:hAnsi="Consolas"/>
+          <w:sz w:val="17"/>
+        </w:rPr>
+        <w:br/>
+      </w:r>
+      <w:r>
+        <w:rPr>
+          <w:rFonts w:ascii="Consolas" w:hAnsi="Consolas"/>
+          <w:sz w:val="17"/>
+        </w:rPr>
+      </w:r>
+      <w:r>
+        <w:rPr>
+          <w:rFonts w:ascii="Consolas" w:hAnsi="Consolas"/>
+          <w:sz w:val="17"/>
+        </w:rPr>
+        <w:br/>
+      </w:r>
+      <w:r>
+        <w:rPr>
+          <w:rFonts w:ascii="Consolas" w:hAnsi="Consolas"/>
+          <w:sz w:val="17"/>
+        </w:rPr>
+      </w:r>
+      <w:r>
+        <w:rPr>
+          <w:rFonts w:ascii="Consolas" w:hAnsi="Consolas"/>
+          <w:sz w:val="17"/>
+        </w:rPr>
+        <w:br/>
+      </w:r>
+      <w:r>
+        <w:rPr>
+          <w:rFonts w:ascii="Consolas" w:hAnsi="Consolas"/>
+          <w:sz w:val="17"/>
+        </w:rPr>
+        <w:t>@dataclass</w:t>
+      </w:r>
+      <w:r>
+        <w:rPr>
+          <w:rFonts w:ascii="Consolas" w:hAnsi="Consolas"/>
+          <w:sz w:val="17"/>
+        </w:rPr>
+        <w:br/>
+      </w:r>
+      <w:r>
+        <w:rPr>
+          <w:rFonts w:ascii="Consolas" w:hAnsi="Consolas"/>
+          <w:sz w:val="17"/>
+        </w:rPr>
+        <w:t>class QuoteResult:</w:t>
+      </w:r>
+      <w:r>
+        <w:rPr>
+          <w:rFonts w:ascii="Consolas" w:hAnsi="Consolas"/>
+          <w:sz w:val="17"/>
+        </w:rPr>
+        <w:br/>
+      </w:r>
+      <w:r>
+        <w:rPr>
+          <w:rFonts w:ascii="Consolas" w:hAnsi="Consolas"/>
+          <w:sz w:val="17"/>
+        </w:rPr>
+        <w:t xml:space="preserve">    quote_id: str</w:t>
+      </w:r>
+      <w:r>
+        <w:rPr>
+          <w:rFonts w:ascii="Consolas" w:hAnsi="Consolas"/>
+          <w:sz w:val="17"/>
+        </w:rPr>
+        <w:br/>
+      </w:r>
+      <w:r>
+        <w:rPr>
+          <w:rFonts w:ascii="Consolas" w:hAnsi="Consolas"/>
+          <w:sz w:val="17"/>
+        </w:rPr>
+        <w:t xml:space="preserve">    from_asset: str</w:t>
+      </w:r>
+      <w:r>
+        <w:rPr>
+          <w:rFonts w:ascii="Consolas" w:hAnsi="Consolas"/>
+          <w:sz w:val="17"/>
+        </w:rPr>
+        <w:br/>
+      </w:r>
+      <w:r>
+        <w:rPr>
+          <w:rFonts w:ascii="Consolas" w:hAnsi="Consolas"/>
+          <w:sz w:val="17"/>
+        </w:rPr>
+        <w:t xml:space="preserve">    to_asset: str</w:t>
+      </w:r>
+      <w:r>
+        <w:rPr>
+          <w:rFonts w:ascii="Consolas" w:hAnsi="Consolas"/>
+          <w:sz w:val="17"/>
+        </w:rPr>
+        <w:br/>
+      </w:r>
+      <w:r>
+        <w:rPr>
+          <w:rFonts w:ascii="Consolas" w:hAnsi="Consolas"/>
+          <w:sz w:val="17"/>
+        </w:rPr>
+        <w:t xml:space="preserve">    from_amount: Decimal</w:t>
+      </w:r>
+      <w:r>
+        <w:rPr>
+          <w:rFonts w:ascii="Consolas" w:hAnsi="Consolas"/>
+          <w:sz w:val="17"/>
+        </w:rPr>
+        <w:br/>
+      </w:r>
+      <w:r>
+        <w:rPr>
+          <w:rFonts w:ascii="Consolas" w:hAnsi="Consolas"/>
+          <w:sz w:val="17"/>
+        </w:rPr>
+        <w:t xml:space="preserve">    to_amount: Decimal</w:t>
+      </w:r>
+      <w:r>
+        <w:rPr>
+          <w:rFonts w:ascii="Consolas" w:hAnsi="Consolas"/>
+          <w:sz w:val="17"/>
+        </w:rPr>
+        <w:br/>
+      </w:r>
+      <w:r>
+        <w:rPr>
+          <w:rFonts w:ascii="Consolas" w:hAnsi="Consolas"/>
+          <w:sz w:val="17"/>
+        </w:rPr>
+        <w:t xml:space="preserve">    fee: Decimal</w:t>
+      </w:r>
+      <w:r>
+        <w:rPr>
+          <w:rFonts w:ascii="Consolas" w:hAnsi="Consolas"/>
+          <w:sz w:val="17"/>
+        </w:rPr>
+        <w:br/>
+      </w:r>
+      <w:r>
+        <w:rPr>
+          <w:rFonts w:ascii="Consolas" w:hAnsi="Consolas"/>
+          <w:sz w:val="17"/>
+        </w:rPr>
+        <w:t xml:space="preserve">    expires_at: str</w:t>
+      </w:r>
+      <w:r>
+        <w:rPr>
+          <w:rFonts w:ascii="Consolas" w:hAnsi="Consolas"/>
+          <w:sz w:val="17"/>
+        </w:rPr>
+        <w:br/>
+      </w:r>
+      <w:r>
+        <w:rPr>
+          <w:rFonts w:ascii="Consolas" w:hAnsi="Consolas"/>
+          <w:sz w:val="17"/>
+        </w:rPr>
+      </w:r>
+      <w:r>
+        <w:rPr>
+          <w:rFonts w:ascii="Consolas" w:hAnsi="Consolas"/>
+          <w:sz w:val="17"/>
+        </w:rPr>
+        <w:br/>
+      </w:r>
+      <w:r>
+        <w:rPr>
+          <w:rFonts w:ascii="Consolas" w:hAnsi="Consolas"/>
+          <w:sz w:val="17"/>
+        </w:rPr>
+      </w:r>
+      <w:r>
+        <w:rPr>
+          <w:rFonts w:ascii="Consolas" w:hAnsi="Consolas"/>
+          <w:sz w:val="17"/>
+        </w:rPr>
+        <w:br/>
+      </w:r>
+      <w:r>
+        <w:rPr>
+          <w:rFonts w:ascii="Consolas" w:hAnsi="Consolas"/>
+          <w:sz w:val="17"/>
+        </w:rPr>
+        <w:t>class StablecoinProviderInterface(ABC):</w:t>
+      </w:r>
+      <w:r>
+        <w:rPr>
+          <w:rFonts w:ascii="Consolas" w:hAnsi="Consolas"/>
+          <w:sz w:val="17"/>
+        </w:rPr>
+        <w:br/>
+      </w:r>
+      <w:r>
+        <w:rPr>
+          <w:rFonts w:ascii="Consolas" w:hAnsi="Consolas"/>
+          <w:sz w:val="17"/>
+        </w:rPr>
+        <w:t xml:space="preserve">    """Contract for a regulated stablecoin partner (e.g. Zero Hash).</w:t>
+      </w:r>
+      <w:r>
+        <w:rPr>
+          <w:rFonts w:ascii="Consolas" w:hAnsi="Consolas"/>
+          <w:sz w:val="17"/>
+        </w:rPr>
+        <w:br/>
+      </w:r>
+      <w:r>
+        <w:rPr>
+          <w:rFonts w:ascii="Consolas" w:hAnsi="Consolas"/>
+          <w:sz w:val="17"/>
+        </w:rPr>
+        <w:t xml:space="preserve">    USDC and USD1 ride the same implementation."""</w:t>
+      </w:r>
+      <w:r>
+        <w:rPr>
+          <w:rFonts w:ascii="Consolas" w:hAnsi="Consolas"/>
+          <w:sz w:val="17"/>
+        </w:rPr>
+        <w:br/>
+      </w:r>
+      <w:r>
+        <w:rPr>
+          <w:rFonts w:ascii="Consolas" w:hAnsi="Consolas"/>
+          <w:sz w:val="17"/>
+        </w:rPr>
+      </w:r>
+      <w:r>
+        <w:rPr>
+          <w:rFonts w:ascii="Consolas" w:hAnsi="Consolas"/>
+          <w:sz w:val="17"/>
+        </w:rPr>
+        <w:br/>
+      </w:r>
+      <w:r>
+        <w:rPr>
+          <w:rFonts w:ascii="Consolas" w:hAnsi="Consolas"/>
+          <w:sz w:val="17"/>
+        </w:rPr>
+        <w:t xml:space="preserve">    # --- onboarding / KYC ---</w:t>
+      </w:r>
+      <w:r>
+        <w:rPr>
+          <w:rFonts w:ascii="Consolas" w:hAnsi="Consolas"/>
+          <w:sz w:val="17"/>
+        </w:rPr>
+        <w:br/>
+      </w:r>
+      <w:r>
+        <w:rPr>
+          <w:rFonts w:ascii="Consolas" w:hAnsi="Consolas"/>
+          <w:sz w:val="17"/>
+        </w:rPr>
+        <w:t xml:space="preserve">    @abstractmethod</w:t>
+      </w:r>
+      <w:r>
+        <w:rPr>
+          <w:rFonts w:ascii="Consolas" w:hAnsi="Consolas"/>
+          <w:sz w:val="17"/>
+        </w:rPr>
+        <w:br/>
+      </w:r>
+      <w:r>
+        <w:rPr>
+          <w:rFonts w:ascii="Consolas" w:hAnsi="Consolas"/>
+          <w:sz w:val="17"/>
+        </w:rPr>
+        <w:t xml:space="preserve">    def submit_kyc(self, user_id: str, payload: dict) -&gt; str: ...          # -&gt; partner_kyc_id</w:t>
+      </w:r>
+      <w:r>
+        <w:rPr>
+          <w:rFonts w:ascii="Consolas" w:hAnsi="Consolas"/>
+          <w:sz w:val="17"/>
+        </w:rPr>
+        <w:br/>
+      </w:r>
+      <w:r>
+        <w:rPr>
+          <w:rFonts w:ascii="Consolas" w:hAnsi="Consolas"/>
+          <w:sz w:val="17"/>
+        </w:rPr>
+        <w:t xml:space="preserve">    @abstractmethod</w:t>
+      </w:r>
+      <w:r>
+        <w:rPr>
+          <w:rFonts w:ascii="Consolas" w:hAnsi="Consolas"/>
+          <w:sz w:val="17"/>
+        </w:rPr>
+        <w:br/>
+      </w:r>
+      <w:r>
+        <w:rPr>
+          <w:rFonts w:ascii="Consolas" w:hAnsi="Consolas"/>
+          <w:sz w:val="17"/>
+        </w:rPr>
+        <w:t xml:space="preserve">    def get_kyc_status(self, partner_kyc_id: str) -&gt; KycStatus: ...</w:t>
+      </w:r>
+      <w:r>
+        <w:rPr>
+          <w:rFonts w:ascii="Consolas" w:hAnsi="Consolas"/>
+          <w:sz w:val="17"/>
+        </w:rPr>
+        <w:br/>
+      </w:r>
+      <w:r>
+        <w:rPr>
+          <w:rFonts w:ascii="Consolas" w:hAnsi="Consolas"/>
+          <w:sz w:val="17"/>
+        </w:rPr>
+      </w:r>
+      <w:r>
+        <w:rPr>
+          <w:rFonts w:ascii="Consolas" w:hAnsi="Consolas"/>
+          <w:sz w:val="17"/>
+        </w:rPr>
+        <w:br/>
+      </w:r>
+      <w:r>
+        <w:rPr>
+          <w:rFonts w:ascii="Consolas" w:hAnsi="Consolas"/>
+          <w:sz w:val="17"/>
+        </w:rPr>
+        <w:t xml:space="preserve">    # --- accounts / addresses ---</w:t>
+      </w:r>
+      <w:r>
+        <w:rPr>
+          <w:rFonts w:ascii="Consolas" w:hAnsi="Consolas"/>
+          <w:sz w:val="17"/>
+        </w:rPr>
+        <w:br/>
+      </w:r>
+      <w:r>
+        <w:rPr>
+          <w:rFonts w:ascii="Consolas" w:hAnsi="Consolas"/>
+          <w:sz w:val="17"/>
+        </w:rPr>
+        <w:t xml:space="preserve">    @abstractmethod</w:t>
+      </w:r>
+      <w:r>
+        <w:rPr>
+          <w:rFonts w:ascii="Consolas" w:hAnsi="Consolas"/>
+          <w:sz w:val="17"/>
+        </w:rPr>
+        <w:br/>
+      </w:r>
+      <w:r>
+        <w:rPr>
+          <w:rFonts w:ascii="Consolas" w:hAnsi="Consolas"/>
+          <w:sz w:val="17"/>
+        </w:rPr>
+        <w:t xml:space="preserve">    def create_account(self, owner_id: str, asset_code: str, network: str) -&gt; CryptoAccount: ...</w:t>
+      </w:r>
+      <w:r>
+        <w:rPr>
+          <w:rFonts w:ascii="Consolas" w:hAnsi="Consolas"/>
+          <w:sz w:val="17"/>
+        </w:rPr>
+        <w:br/>
+      </w:r>
+      <w:r>
+        <w:rPr>
+          <w:rFonts w:ascii="Consolas" w:hAnsi="Consolas"/>
+          <w:sz w:val="17"/>
+        </w:rPr>
+        <w:t xml:space="preserve">    @abstractmethod</w:t>
+      </w:r>
+      <w:r>
+        <w:rPr>
+          <w:rFonts w:ascii="Consolas" w:hAnsi="Consolas"/>
+          <w:sz w:val="17"/>
+        </w:rPr>
+        <w:br/>
+      </w:r>
+      <w:r>
+        <w:rPr>
+          <w:rFonts w:ascii="Consolas" w:hAnsi="Consolas"/>
+          <w:sz w:val="17"/>
+        </w:rPr>
+        <w:t xml:space="preserve">    def get_deposit_address(self, partner_account_id: str, asset_code: str, network: str) -&gt; str: ...</w:t>
+      </w:r>
+      <w:r>
+        <w:rPr>
+          <w:rFonts w:ascii="Consolas" w:hAnsi="Consolas"/>
+          <w:sz w:val="17"/>
+        </w:rPr>
+        <w:br/>
+      </w:r>
+      <w:r>
+        <w:rPr>
+          <w:rFonts w:ascii="Consolas" w:hAnsi="Consolas"/>
+          <w:sz w:val="17"/>
+        </w:rPr>
+        <w:t xml:space="preserve">    @abstractmethod</w:t>
+      </w:r>
+      <w:r>
+        <w:rPr>
+          <w:rFonts w:ascii="Consolas" w:hAnsi="Consolas"/>
+          <w:sz w:val="17"/>
+        </w:rPr>
+        <w:br/>
+      </w:r>
+      <w:r>
+        <w:rPr>
+          <w:rFonts w:ascii="Consolas" w:hAnsi="Consolas"/>
+          <w:sz w:val="17"/>
+        </w:rPr>
+        <w:t xml:space="preserve">    def get_balance(self, partner_account_id: str, asset_code: str) -&gt; Decimal: ...</w:t>
+      </w:r>
+      <w:r>
+        <w:rPr>
+          <w:rFonts w:ascii="Consolas" w:hAnsi="Consolas"/>
+          <w:sz w:val="17"/>
+        </w:rPr>
+        <w:br/>
+      </w:r>
+      <w:r>
+        <w:rPr>
+          <w:rFonts w:ascii="Consolas" w:hAnsi="Consolas"/>
+          <w:sz w:val="17"/>
+        </w:rPr>
+      </w:r>
+      <w:r>
+        <w:rPr>
+          <w:rFonts w:ascii="Consolas" w:hAnsi="Consolas"/>
+          <w:sz w:val="17"/>
+        </w:rPr>
+        <w:br/>
+      </w:r>
+      <w:r>
+        <w:rPr>
+          <w:rFonts w:ascii="Consolas" w:hAnsi="Consolas"/>
+          <w:sz w:val="17"/>
+        </w:rPr>
+        <w:t xml:space="preserve">    # --- ramps (USD &lt;-&gt; stablecoin) ---</w:t>
+      </w:r>
+      <w:r>
+        <w:rPr>
+          <w:rFonts w:ascii="Consolas" w:hAnsi="Consolas"/>
+          <w:sz w:val="17"/>
+        </w:rPr>
+        <w:br/>
+      </w:r>
+      <w:r>
+        <w:rPr>
+          <w:rFonts w:ascii="Consolas" w:hAnsi="Consolas"/>
+          <w:sz w:val="17"/>
+        </w:rPr>
+        <w:t xml:space="preserve">    @abstractmethod</w:t>
+      </w:r>
+      <w:r>
+        <w:rPr>
+          <w:rFonts w:ascii="Consolas" w:hAnsi="Consolas"/>
+          <w:sz w:val="17"/>
+        </w:rPr>
+        <w:br/>
+      </w:r>
+      <w:r>
+        <w:rPr>
+          <w:rFonts w:ascii="Consolas" w:hAnsi="Consolas"/>
+          <w:sz w:val="17"/>
+        </w:rPr>
+        <w:t xml:space="preserve">    def quote_onramp(self, usd_amount: Decimal, asset_code: str) -&gt; QuoteResult: ...</w:t>
+      </w:r>
+      <w:r>
+        <w:rPr>
+          <w:rFonts w:ascii="Consolas" w:hAnsi="Consolas"/>
+          <w:sz w:val="17"/>
+        </w:rPr>
+        <w:br/>
+      </w:r>
+      <w:r>
+        <w:rPr>
+          <w:rFonts w:ascii="Consolas" w:hAnsi="Consolas"/>
+          <w:sz w:val="17"/>
+        </w:rPr>
+        <w:t xml:space="preserve">    @abstractmethod</w:t>
+      </w:r>
+      <w:r>
+        <w:rPr>
+          <w:rFonts w:ascii="Consolas" w:hAnsi="Consolas"/>
+          <w:sz w:val="17"/>
+        </w:rPr>
+        <w:br/>
+      </w:r>
+      <w:r>
+        <w:rPr>
+          <w:rFonts w:ascii="Consolas" w:hAnsi="Consolas"/>
+          <w:sz w:val="17"/>
+        </w:rPr>
+        <w:t xml:space="preserve">    def execute_onramp(self, quote_id: str, idempotency_key: str) -&gt; TransferResult: ...</w:t>
+      </w:r>
+      <w:r>
+        <w:rPr>
+          <w:rFonts w:ascii="Consolas" w:hAnsi="Consolas"/>
+          <w:sz w:val="17"/>
+        </w:rPr>
+        <w:br/>
+      </w:r>
+      <w:r>
+        <w:rPr>
+          <w:rFonts w:ascii="Consolas" w:hAnsi="Consolas"/>
+          <w:sz w:val="17"/>
+        </w:rPr>
+        <w:t xml:space="preserve">    @abstractmethod</w:t>
+      </w:r>
+      <w:r>
+        <w:rPr>
+          <w:rFonts w:ascii="Consolas" w:hAnsi="Consolas"/>
+          <w:sz w:val="17"/>
+        </w:rPr>
+        <w:br/>
+      </w:r>
+      <w:r>
+        <w:rPr>
+          <w:rFonts w:ascii="Consolas" w:hAnsi="Consolas"/>
+          <w:sz w:val="17"/>
+        </w:rPr>
+        <w:t xml:space="preserve">    def quote_offramp(self, asset_amount: Decimal, asset_code: str) -&gt; QuoteResult: ...</w:t>
+      </w:r>
+      <w:r>
+        <w:rPr>
+          <w:rFonts w:ascii="Consolas" w:hAnsi="Consolas"/>
+          <w:sz w:val="17"/>
+        </w:rPr>
+        <w:br/>
+      </w:r>
+      <w:r>
+        <w:rPr>
+          <w:rFonts w:ascii="Consolas" w:hAnsi="Consolas"/>
+          <w:sz w:val="17"/>
+        </w:rPr>
+        <w:t xml:space="preserve">    @abstractmethod</w:t>
+      </w:r>
+      <w:r>
+        <w:rPr>
+          <w:rFonts w:ascii="Consolas" w:hAnsi="Consolas"/>
+          <w:sz w:val="17"/>
+        </w:rPr>
+        <w:br/>
+      </w:r>
+      <w:r>
+        <w:rPr>
+          <w:rFonts w:ascii="Consolas" w:hAnsi="Consolas"/>
+          <w:sz w:val="17"/>
+        </w:rPr>
+        <w:t xml:space="preserve">    def execute_offramp(self, quote_id: str, idempotency_key: str) -&gt; TransferResult: ...</w:t>
+      </w:r>
+      <w:r>
+        <w:rPr>
+          <w:rFonts w:ascii="Consolas" w:hAnsi="Consolas"/>
+          <w:sz w:val="17"/>
+        </w:rPr>
+        <w:br/>
+      </w:r>
+      <w:r>
+        <w:rPr>
+          <w:rFonts w:ascii="Consolas" w:hAnsi="Consolas"/>
+          <w:sz w:val="17"/>
+        </w:rPr>
+      </w:r>
+      <w:r>
+        <w:rPr>
+          <w:rFonts w:ascii="Consolas" w:hAnsi="Consolas"/>
+          <w:sz w:val="17"/>
+        </w:rPr>
+        <w:br/>
+      </w:r>
+      <w:r>
+        <w:rPr>
+          <w:rFonts w:ascii="Consolas" w:hAnsi="Consolas"/>
+          <w:sz w:val="17"/>
+        </w:rPr>
+        <w:t xml:space="preserve">    # --- transfers ---</w:t>
+      </w:r>
+      <w:r>
+        <w:rPr>
+          <w:rFonts w:ascii="Consolas" w:hAnsi="Consolas"/>
+          <w:sz w:val="17"/>
+        </w:rPr>
+        <w:br/>
+      </w:r>
+      <w:r>
+        <w:rPr>
+          <w:rFonts w:ascii="Consolas" w:hAnsi="Consolas"/>
+          <w:sz w:val="17"/>
+        </w:rPr>
+        <w:t xml:space="preserve">    @abstractmethod</w:t>
+      </w:r>
+      <w:r>
+        <w:rPr>
+          <w:rFonts w:ascii="Consolas" w:hAnsi="Consolas"/>
+          <w:sz w:val="17"/>
+        </w:rPr>
+        <w:br/>
+      </w:r>
+      <w:r>
+        <w:rPr>
+          <w:rFonts w:ascii="Consolas" w:hAnsi="Consolas"/>
+          <w:sz w:val="17"/>
+        </w:rPr>
+        <w:t xml:space="preserve">    def transfer(self, from_account_id: str, to_address: str, asset_code: str,</w:t>
+      </w:r>
+      <w:r>
+        <w:rPr>
+          <w:rFonts w:ascii="Consolas" w:hAnsi="Consolas"/>
+          <w:sz w:val="17"/>
+        </w:rPr>
+        <w:br/>
+      </w:r>
+      <w:r>
+        <w:rPr>
+          <w:rFonts w:ascii="Consolas" w:hAnsi="Consolas"/>
+          <w:sz w:val="17"/>
+        </w:rPr>
+        <w:t xml:space="preserve">                 network: str, amount: Decimal, idempotency_key: str) -&gt; TransferResult: ...</w:t>
+      </w:r>
+      <w:r>
+        <w:rPr>
+          <w:rFonts w:ascii="Consolas" w:hAnsi="Consolas"/>
+          <w:sz w:val="17"/>
+        </w:rPr>
+        <w:br/>
+      </w:r>
+      <w:r>
+        <w:rPr>
+          <w:rFonts w:ascii="Consolas" w:hAnsi="Consolas"/>
+          <w:sz w:val="17"/>
+        </w:rPr>
+        <w:t xml:space="preserve">    @abstractmethod</w:t>
+      </w:r>
+      <w:r>
+        <w:rPr>
+          <w:rFonts w:ascii="Consolas" w:hAnsi="Consolas"/>
+          <w:sz w:val="17"/>
+        </w:rPr>
+        <w:br/>
+      </w:r>
+      <w:r>
+        <w:rPr>
+          <w:rFonts w:ascii="Consolas" w:hAnsi="Consolas"/>
+          <w:sz w:val="17"/>
+        </w:rPr>
+        <w:t xml:space="preserve">    def get_transfer_status(self, partner_transfer_id: str) -&gt; TransferResult: ...</w:t>
+      </w:r>
+      <w:r>
+        <w:rPr>
+          <w:rFonts w:ascii="Consolas" w:hAnsi="Consolas"/>
+          <w:sz w:val="17"/>
+        </w:rPr>
+        <w:br/>
+      </w:r>
+      <w:r>
+        <w:rPr>
+          <w:rFonts w:ascii="Consolas" w:hAnsi="Consolas"/>
+          <w:sz w:val="17"/>
+        </w:rPr>
+      </w:r>
+      <w:r>
+        <w:rPr>
+          <w:rFonts w:ascii="Consolas" w:hAnsi="Consolas"/>
+          <w:sz w:val="17"/>
+        </w:rPr>
+        <w:br/>
+      </w:r>
+      <w:r>
+        <w:rPr>
+          <w:rFonts w:ascii="Consolas" w:hAnsi="Consolas"/>
+          <w:sz w:val="17"/>
+        </w:rPr>
+        <w:t xml:space="preserve">    # --- webhooks ---</w:t>
+      </w:r>
+      <w:r>
+        <w:rPr>
+          <w:rFonts w:ascii="Consolas" w:hAnsi="Consolas"/>
+          <w:sz w:val="17"/>
+        </w:rPr>
+        <w:br/>
+      </w:r>
+      <w:r>
+        <w:rPr>
+          <w:rFonts w:ascii="Consolas" w:hAnsi="Consolas"/>
+          <w:sz w:val="17"/>
+        </w:rPr>
+        <w:t xml:space="preserve">    @abstractmethod</w:t>
+      </w:r>
+      <w:r>
+        <w:rPr>
+          <w:rFonts w:ascii="Consolas" w:hAnsi="Consolas"/>
+          <w:sz w:val="17"/>
+        </w:rPr>
+        <w:br/>
+      </w:r>
+      <w:r>
+        <w:rPr>
+          <w:rFonts w:ascii="Consolas" w:hAnsi="Consolas"/>
+          <w:sz w:val="17"/>
+        </w:rPr>
+        <w:t xml:space="preserve">    def verify_webhook(self, headers: dict, raw_body: bytes) -&gt; bool: ...</w:t>
+      </w:r>
+      <w:r>
+        <w:rPr>
+          <w:rFonts w:ascii="Consolas" w:hAnsi="Consolas"/>
+          <w:sz w:val="17"/>
+        </w:rPr>
+        <w:br/>
+      </w:r>
+      <w:r>
+        <w:rPr>
+          <w:rFonts w:ascii="Consolas" w:hAnsi="Consolas"/>
+          <w:sz w:val="17"/>
+        </w:rPr>
+        <w:t xml:space="preserve">    @abstractmethod</w:t>
+      </w:r>
+      <w:r>
+        <w:rPr>
+          <w:rFonts w:ascii="Consolas" w:hAnsi="Consolas"/>
+          <w:sz w:val="17"/>
+        </w:rPr>
+        <w:br/>
+      </w:r>
+      <w:r>
+        <w:rPr>
+          <w:rFonts w:ascii="Consolas" w:hAnsi="Consolas"/>
+          <w:sz w:val="17"/>
+        </w:rPr>
+        <w:t xml:space="preserve">    def parse_webhook_event(self, raw_body: bytes) -&gt; dict: ...</w:t>
+      </w:r>
+    </w:p>
+    <w:p>
+      <w:pPr>
+        <w:pStyle w:val="Heading2"/>
+      </w:pPr>
+      <w:r>
+        <w:t>B.8 Wiring &amp; Invariants</w:t>
+      </w:r>
+    </w:p>
+    <w:p>
+      <w:r>
+        <w:t>Key rules the implementation must uphold:</w:t>
+      </w:r>
+    </w:p>
+    <w:p>
+      <w:pPr>
+        <w:pStyle w:val="ListBullet"/>
+      </w:pPr>
+      <w:r>
+        <w:t>Provider is dependency-injected (get_stablecoin_provider) so tests use MockStablecoinProvider.</w:t>
+      </w:r>
+    </w:p>
+    <w:p>
+      <w:pPr>
+        <w:pStyle w:val="ListBullet"/>
+      </w:pPr>
+      <w:r>
+        <w:t>Webhook router /webhooks/stablecoin calls verify_webhook first; events are idempotent by partner event id / onchain_tx_hash (reuse the existing idempotency discipline).</w:t>
+      </w:r>
+    </w:p>
+    <w:p>
+      <w:pPr>
+        <w:pStyle w:val="ListBullet"/>
+      </w:pPr>
+      <w:r>
+        <w:t>Ledger is credited only when a transfer/deposit reaches OnchainStatus.CONFIRMED (&gt;= asset_networks.min_confirmations); confirming/submitted states never move balances.</w:t>
+      </w:r>
+    </w:p>
+    <w:p>
+      <w:pPr>
+        <w:pStyle w:val="ListBullet"/>
+      </w:pPr>
+      <w:r>
+        <w:t>Every on-chain ledger entry carries onchain_tx_hash + partner_transfer_id for the audit trail; reconciliation_service compares partner balances vs ledger per (owner, asset).</w:t>
+      </w:r>
+    </w:p>
+    <w:p>
+      <w:pPr>
+        <w:pStyle w:val="ListBullet"/>
+      </w:pPr>
+      <w:r>
+        <w:t>All crypto actions are gated on kyc_records.status == 'approved' for the user.</w:t>
       </w:r>
     </w:p>
     <w:sectPr>

</xml_diff>